<commit_message>
fix (PT theme - Deliverable templates EN):  deformatting
</commit_message>
<xml_diff>
--- a/deliveries/cases/EN/3.docx
+++ b/deliveries/cases/EN/3.docx
@@ -36,7 +36,7 @@
             <wp:extent cx="1880235" cy="1381716"/>
             <wp:effectExtent b="0" l="0" r="0" t="0"/>
             <wp:wrapSquare wrapText="bothSides" distB="0" distT="0" distL="114300" distR="114300"/>
-            <wp:docPr id="13" name="image2.png"/>
+            <wp:docPr id="11" name="image2.png"/>
             <a:graphic>
               <a:graphicData uri="http://schemas.openxmlformats.org/drawingml/2006/picture">
                 <pic:pic>
@@ -202,7 +202,7 @@
           <w:color w:val="231f20"/>
         </w:rPr>
       </w:pPr>
-      <w:bookmarkStart w:colFirst="0" w:colLast="0" w:name="_1qihy4r72vs5" w:id="0"/>
+      <w:bookmarkStart w:colFirst="0" w:colLast="0" w:name="_a2q0ls2hwfb3" w:id="0"/>
       <w:bookmarkEnd w:id="0"/>
       <w:r>
         <w:rPr>
@@ -287,7 +287,7 @@
     </w:p>
     <w:p>
       <w:pPr>
-        <w:ind w:left="1560" w:right="-4.724409448817823" w:firstLine="0"/>
+        <w:ind w:left="0" w:right="0" w:firstLine="0"/>
         <w:jc w:val="center"/>
         <w:rPr>
           <w:rFonts w:ascii="Arial" w:cs="Arial" w:eastAsia="Arial" w:hAnsi="Arial"/>
@@ -308,12 +308,12 @@
           <w:szCs w:val="36"/>
           <w:rtl w:val="0"/>
         </w:rPr>
-        <w:t xml:space="preserve">Information security - </w:t>
-      </w:r>
-    </w:p>
-    <w:p>
-      <w:pPr>
-        <w:ind w:left="1560" w:right="-4.724409448817823" w:firstLine="0"/>
+        <w:t xml:space="preserve">Information security -</w:t>
+      </w:r>
+    </w:p>
+    <w:p>
+      <w:pPr>
+        <w:ind w:left="0" w:right="0" w:firstLine="0"/>
         <w:jc w:val="center"/>
         <w:rPr>
           <w:rFonts w:ascii="Arial" w:cs="Arial" w:eastAsia="Arial" w:hAnsi="Arial"/>
@@ -1005,7 +1005,7 @@
     </w:p>
     <w:sdt>
       <w:sdtPr>
-        <w:id w:val="-896006879"/>
+        <w:id w:val="-89457496"/>
         <w:docPartObj>
           <w:docPartGallery w:val="Table of Contents"/>
           <w:docPartUnique w:val="1"/>
@@ -1052,7 +1052,7 @@
             <w:instrText xml:space="preserve"> TOC \h \u \z \t "Heading 1,1,Heading 2,2,Heading 3,3,"</w:instrText>
             <w:fldChar w:fldCharType="separate"/>
           </w:r>
-          <w:hyperlink w:anchor="_4i712jet9q63">
+          <w:hyperlink w:anchor="_o53k9faklwsq">
             <w:r>
               <w:rPr>
                 <w:rFonts w:ascii="Arial" w:cs="Arial" w:eastAsia="Arial" w:hAnsi="Arial"/>
@@ -1073,7 +1073,7 @@
               <w:t xml:space="preserve">1</w:t>
             </w:r>
           </w:hyperlink>
-          <w:hyperlink w:anchor="_4i712jet9q63">
+          <w:hyperlink w:anchor="_o53k9faklwsq">
             <w:r>
               <w:rPr>
                 <w:rFonts w:ascii="Arial" w:cs="Arial" w:eastAsia="Arial" w:hAnsi="Arial"/>
@@ -1094,7 +1094,7 @@
           </w:hyperlink>
           <w:r>
             <w:fldChar w:fldCharType="begin"/>
-            <w:instrText xml:space="preserve"> PAGEREF _4i712jet9q63 \h </w:instrText>
+            <w:instrText xml:space="preserve"> PAGEREF _o53k9faklwsq \h </w:instrText>
             <w:fldChar w:fldCharType="separate"/>
           </w:r>
           <w:r>
@@ -1162,7 +1162,7 @@
               <w:vertAlign w:val="baseline"/>
             </w:rPr>
           </w:pPr>
-          <w:hyperlink w:anchor="_8nxsjoqkwjqo">
+          <w:hyperlink w:anchor="_plxk9fbxvnuq">
             <w:r>
               <w:rPr>
                 <w:rFonts w:ascii="Arial" w:cs="Arial" w:eastAsia="Arial" w:hAnsi="Arial"/>
@@ -1181,7 +1181,7 @@
               <w:t xml:space="preserve">1.1</w:t>
             </w:r>
           </w:hyperlink>
-          <w:hyperlink w:anchor="_8nxsjoqkwjqo">
+          <w:hyperlink w:anchor="_plxk9fbxvnuq">
             <w:r>
               <w:rPr>
                 <w:rFonts w:ascii="Arial" w:cs="Arial" w:eastAsia="Arial" w:hAnsi="Arial"/>
@@ -1202,7 +1202,7 @@
           </w:hyperlink>
           <w:r>
             <w:fldChar w:fldCharType="begin"/>
-            <w:instrText xml:space="preserve"> PAGEREF _8nxsjoqkwjqo \h </w:instrText>
+            <w:instrText xml:space="preserve"> PAGEREF _plxk9fbxvnuq \h </w:instrText>
             <w:fldChar w:fldCharType="separate"/>
           </w:r>
           <w:r>
@@ -1268,7 +1268,7 @@
               <w:vertAlign w:val="baseline"/>
             </w:rPr>
           </w:pPr>
-          <w:hyperlink w:anchor="_6fzxhec7xdn6">
+          <w:hyperlink w:anchor="_g5fxrpoqf0b">
             <w:r>
               <w:rPr>
                 <w:rFonts w:ascii="Arial" w:cs="Arial" w:eastAsia="Arial" w:hAnsi="Arial"/>
@@ -1287,7 +1287,7 @@
               <w:t xml:space="preserve">1.2</w:t>
             </w:r>
           </w:hyperlink>
-          <w:hyperlink w:anchor="_6fzxhec7xdn6">
+          <w:hyperlink w:anchor="_g5fxrpoqf0b">
             <w:r>
               <w:rPr>
                 <w:rFonts w:ascii="Arial" w:cs="Arial" w:eastAsia="Arial" w:hAnsi="Arial"/>
@@ -1308,7 +1308,7 @@
           </w:hyperlink>
           <w:r>
             <w:fldChar w:fldCharType="begin"/>
-            <w:instrText xml:space="preserve"> PAGEREF _6fzxhec7xdn6 \h </w:instrText>
+            <w:instrText xml:space="preserve"> PAGEREF _g5fxrpoqf0b \h </w:instrText>
             <w:fldChar w:fldCharType="separate"/>
           </w:r>
           <w:r>
@@ -1374,7 +1374,7 @@
               <w:vertAlign w:val="baseline"/>
             </w:rPr>
           </w:pPr>
-          <w:hyperlink w:anchor="_p535f650dprb">
+          <w:hyperlink w:anchor="_3zr1wby4tod">
             <w:r>
               <w:rPr>
                 <w:rFonts w:ascii="Arial" w:cs="Arial" w:eastAsia="Arial" w:hAnsi="Arial"/>
@@ -1393,7 +1393,7 @@
               <w:t xml:space="preserve">1.3</w:t>
             </w:r>
           </w:hyperlink>
-          <w:hyperlink w:anchor="_p535f650dprb">
+          <w:hyperlink w:anchor="_3zr1wby4tod">
             <w:r>
               <w:rPr>
                 <w:rFonts w:ascii="Arial" w:cs="Arial" w:eastAsia="Arial" w:hAnsi="Arial"/>
@@ -1414,7 +1414,7 @@
           </w:hyperlink>
           <w:r>
             <w:fldChar w:fldCharType="begin"/>
-            <w:instrText xml:space="preserve"> PAGEREF _p535f650dprb \h </w:instrText>
+            <w:instrText xml:space="preserve"> PAGEREF _3zr1wby4tod \h </w:instrText>
             <w:fldChar w:fldCharType="separate"/>
           </w:r>
           <w:r>
@@ -1480,7 +1480,7 @@
               <w:vertAlign w:val="baseline"/>
             </w:rPr>
           </w:pPr>
-          <w:hyperlink w:anchor="_qq7n3ylzfzyy">
+          <w:hyperlink w:anchor="_9tfhh117be5o">
             <w:r>
               <w:rPr>
                 <w:rFonts w:ascii="Arial" w:cs="Arial" w:eastAsia="Arial" w:hAnsi="Arial"/>
@@ -1499,7 +1499,7 @@
               <w:t xml:space="preserve">1.4</w:t>
             </w:r>
           </w:hyperlink>
-          <w:hyperlink w:anchor="_qq7n3ylzfzyy">
+          <w:hyperlink w:anchor="_9tfhh117be5o">
             <w:r>
               <w:rPr>
                 <w:rFonts w:ascii="Arial" w:cs="Arial" w:eastAsia="Arial" w:hAnsi="Arial"/>
@@ -1520,7 +1520,7 @@
           </w:hyperlink>
           <w:r>
             <w:fldChar w:fldCharType="begin"/>
-            <w:instrText xml:space="preserve"> PAGEREF _qq7n3ylzfzyy \h </w:instrText>
+            <w:instrText xml:space="preserve"> PAGEREF _9tfhh117be5o \h </w:instrText>
             <w:fldChar w:fldCharType="separate"/>
           </w:r>
           <w:r>
@@ -1586,7 +1586,7 @@
               <w:vertAlign w:val="baseline"/>
             </w:rPr>
           </w:pPr>
-          <w:hyperlink w:anchor="_8j81hqgtduzy">
+          <w:hyperlink w:anchor="_3w7afet6jht">
             <w:r>
               <w:rPr>
                 <w:rFonts w:ascii="Arial" w:cs="Arial" w:eastAsia="Arial" w:hAnsi="Arial"/>
@@ -1605,7 +1605,7 @@
               <w:t xml:space="preserve">1.5</w:t>
             </w:r>
           </w:hyperlink>
-          <w:hyperlink w:anchor="_8j81hqgtduzy">
+          <w:hyperlink w:anchor="_3w7afet6jht">
             <w:r>
               <w:rPr>
                 <w:rFonts w:ascii="Arial" w:cs="Arial" w:eastAsia="Arial" w:hAnsi="Arial"/>
@@ -1626,7 +1626,7 @@
           </w:hyperlink>
           <w:r>
             <w:fldChar w:fldCharType="begin"/>
-            <w:instrText xml:space="preserve"> PAGEREF _8j81hqgtduzy \h </w:instrText>
+            <w:instrText xml:space="preserve"> PAGEREF _3w7afet6jht \h </w:instrText>
             <w:fldChar w:fldCharType="separate"/>
           </w:r>
           <w:r>
@@ -1692,7 +1692,7 @@
               <w:vertAlign w:val="baseline"/>
             </w:rPr>
           </w:pPr>
-          <w:hyperlink w:anchor="_2hamgqx6bq9b">
+          <w:hyperlink w:anchor="_ntjuh2lop5sz">
             <w:r>
               <w:rPr>
                 <w:rFonts w:ascii="Arial" w:cs="Arial" w:eastAsia="Arial" w:hAnsi="Arial"/>
@@ -1713,7 +1713,7 @@
               <w:t xml:space="preserve">2</w:t>
             </w:r>
           </w:hyperlink>
-          <w:hyperlink w:anchor="_2hamgqx6bq9b">
+          <w:hyperlink w:anchor="_ntjuh2lop5sz">
             <w:r>
               <w:rPr>
                 <w:rFonts w:ascii="Arial" w:cs="Arial" w:eastAsia="Arial" w:hAnsi="Arial"/>
@@ -1734,7 +1734,7 @@
           </w:hyperlink>
           <w:r>
             <w:fldChar w:fldCharType="begin"/>
-            <w:instrText xml:space="preserve"> PAGEREF _2hamgqx6bq9b \h </w:instrText>
+            <w:instrText xml:space="preserve"> PAGEREF _ntjuh2lop5sz \h </w:instrText>
             <w:fldChar w:fldCharType="separate"/>
           </w:r>
           <w:r>
@@ -1802,7 +1802,7 @@
               <w:vertAlign w:val="baseline"/>
             </w:rPr>
           </w:pPr>
-          <w:hyperlink w:anchor="_yyz44jlt1xo6">
+          <w:hyperlink w:anchor="_pjvwvfvu44cy">
             <w:r>
               <w:rPr>
                 <w:rFonts w:ascii="Arial" w:cs="Arial" w:eastAsia="Arial" w:hAnsi="Arial"/>
@@ -1821,7 +1821,7 @@
               <w:t xml:space="preserve">2.1</w:t>
             </w:r>
           </w:hyperlink>
-          <w:hyperlink w:anchor="_yyz44jlt1xo6">
+          <w:hyperlink w:anchor="_pjvwvfvu44cy">
             <w:r>
               <w:rPr>
                 <w:rFonts w:ascii="Arial" w:cs="Arial" w:eastAsia="Arial" w:hAnsi="Arial"/>
@@ -1842,7 +1842,7 @@
           </w:hyperlink>
           <w:r>
             <w:fldChar w:fldCharType="begin"/>
-            <w:instrText xml:space="preserve"> PAGEREF _yyz44jlt1xo6 \h </w:instrText>
+            <w:instrText xml:space="preserve"> PAGEREF _pjvwvfvu44cy \h </w:instrText>
             <w:fldChar w:fldCharType="separate"/>
           </w:r>
           <w:r>
@@ -1908,7 +1908,7 @@
               <w:vertAlign w:val="baseline"/>
             </w:rPr>
           </w:pPr>
-          <w:hyperlink w:anchor="_ti4nlluh37bo">
+          <w:hyperlink w:anchor="_wg4ayx6mtnjj">
             <w:r>
               <w:rPr>
                 <w:rFonts w:ascii="Arial" w:cs="Arial" w:eastAsia="Arial" w:hAnsi="Arial"/>
@@ -1927,7 +1927,7 @@
               <w:t xml:space="preserve">2.2</w:t>
             </w:r>
           </w:hyperlink>
-          <w:hyperlink w:anchor="_ti4nlluh37bo">
+          <w:hyperlink w:anchor="_wg4ayx6mtnjj">
             <w:r>
               <w:rPr>
                 <w:rFonts w:ascii="Arial" w:cs="Arial" w:eastAsia="Arial" w:hAnsi="Arial"/>
@@ -1948,7 +1948,7 @@
           </w:hyperlink>
           <w:r>
             <w:fldChar w:fldCharType="begin"/>
-            <w:instrText xml:space="preserve"> PAGEREF _ti4nlluh37bo \h </w:instrText>
+            <w:instrText xml:space="preserve"> PAGEREF _wg4ayx6mtnjj \h </w:instrText>
             <w:fldChar w:fldCharType="separate"/>
           </w:r>
           <w:r>
@@ -2014,7 +2014,7 @@
               <w:vertAlign w:val="baseline"/>
             </w:rPr>
           </w:pPr>
-          <w:hyperlink w:anchor="_9mmt147o6zc7">
+          <w:hyperlink w:anchor="_81xh5imhqk17">
             <w:r>
               <w:rPr>
                 <w:rFonts w:ascii="Arial" w:cs="Arial" w:eastAsia="Arial" w:hAnsi="Arial"/>
@@ -2033,7 +2033,7 @@
               <w:t xml:space="preserve">2.2.1</w:t>
             </w:r>
           </w:hyperlink>
-          <w:hyperlink w:anchor="_9mmt147o6zc7">
+          <w:hyperlink w:anchor="_81xh5imhqk17">
             <w:r>
               <w:rPr>
                 <w:rFonts w:ascii="Arial" w:cs="Arial" w:eastAsia="Arial" w:hAnsi="Arial"/>
@@ -2054,7 +2054,7 @@
           </w:hyperlink>
           <w:r>
             <w:fldChar w:fldCharType="begin"/>
-            <w:instrText xml:space="preserve"> PAGEREF _9mmt147o6zc7 \h </w:instrText>
+            <w:instrText xml:space="preserve"> PAGEREF _81xh5imhqk17 \h </w:instrText>
             <w:fldChar w:fldCharType="separate"/>
           </w:r>
           <w:r>
@@ -2120,7 +2120,7 @@
               <w:vertAlign w:val="baseline"/>
             </w:rPr>
           </w:pPr>
-          <w:hyperlink w:anchor="_3tzntain28go">
+          <w:hyperlink w:anchor="_hqsqafehz2j6">
             <w:r>
               <w:rPr>
                 <w:rFonts w:ascii="Arial" w:cs="Arial" w:eastAsia="Arial" w:hAnsi="Arial"/>
@@ -2139,7 +2139,7 @@
               <w:t xml:space="preserve">2.2.1.1</w:t>
             </w:r>
           </w:hyperlink>
-          <w:hyperlink w:anchor="_3tzntain28go">
+          <w:hyperlink w:anchor="_hqsqafehz2j6">
             <w:r>
               <w:rPr>
                 <w:rFonts w:ascii="Arial" w:cs="Arial" w:eastAsia="Arial" w:hAnsi="Arial"/>
@@ -2160,7 +2160,7 @@
           </w:hyperlink>
           <w:r>
             <w:fldChar w:fldCharType="begin"/>
-            <w:instrText xml:space="preserve"> PAGEREF _3tzntain28go \h </w:instrText>
+            <w:instrText xml:space="preserve"> PAGEREF _hqsqafehz2j6 \h </w:instrText>
             <w:fldChar w:fldCharType="separate"/>
           </w:r>
           <w:r>
@@ -2226,7 +2226,7 @@
               <w:vertAlign w:val="baseline"/>
             </w:rPr>
           </w:pPr>
-          <w:hyperlink w:anchor="_74mbvrw77rrp">
+          <w:hyperlink w:anchor="_gq16pp76l5o7">
             <w:r>
               <w:rPr>
                 <w:rFonts w:ascii="Arial" w:cs="Arial" w:eastAsia="Arial" w:hAnsi="Arial"/>
@@ -2245,7 +2245,7 @@
               <w:t xml:space="preserve">2.2.1.2</w:t>
             </w:r>
           </w:hyperlink>
-          <w:hyperlink w:anchor="_74mbvrw77rrp">
+          <w:hyperlink w:anchor="_gq16pp76l5o7">
             <w:r>
               <w:rPr>
                 <w:rFonts w:ascii="Arial" w:cs="Arial" w:eastAsia="Arial" w:hAnsi="Arial"/>
@@ -2266,7 +2266,7 @@
           </w:hyperlink>
           <w:r>
             <w:fldChar w:fldCharType="begin"/>
-            <w:instrText xml:space="preserve"> PAGEREF _74mbvrw77rrp \h </w:instrText>
+            <w:instrText xml:space="preserve"> PAGEREF _gq16pp76l5o7 \h </w:instrText>
             <w:fldChar w:fldCharType="separate"/>
           </w:r>
           <w:r>
@@ -2332,7 +2332,7 @@
               <w:vertAlign w:val="baseline"/>
             </w:rPr>
           </w:pPr>
-          <w:hyperlink w:anchor="_n9ifa9sjeh7n">
+          <w:hyperlink w:anchor="_hew0equjkyu8">
             <w:r>
               <w:rPr>
                 <w:rFonts w:ascii="Arial" w:cs="Arial" w:eastAsia="Arial" w:hAnsi="Arial"/>
@@ -2351,7 +2351,7 @@
               <w:t xml:space="preserve">2.2.1.3</w:t>
             </w:r>
           </w:hyperlink>
-          <w:hyperlink w:anchor="_n9ifa9sjeh7n">
+          <w:hyperlink w:anchor="_hew0equjkyu8">
             <w:r>
               <w:rPr>
                 <w:rFonts w:ascii="Arial" w:cs="Arial" w:eastAsia="Arial" w:hAnsi="Arial"/>
@@ -2372,7 +2372,7 @@
           </w:hyperlink>
           <w:r>
             <w:fldChar w:fldCharType="begin"/>
-            <w:instrText xml:space="preserve"> PAGEREF _n9ifa9sjeh7n \h </w:instrText>
+            <w:instrText xml:space="preserve"> PAGEREF _hew0equjkyu8 \h </w:instrText>
             <w:fldChar w:fldCharType="separate"/>
           </w:r>
           <w:r>
@@ -2438,7 +2438,7 @@
               <w:vertAlign w:val="baseline"/>
             </w:rPr>
           </w:pPr>
-          <w:hyperlink w:anchor="_msglliqq2z1">
+          <w:hyperlink w:anchor="_hfdjvzadp2b5">
             <w:r>
               <w:rPr>
                 <w:rFonts w:ascii="Arial" w:cs="Arial" w:eastAsia="Arial" w:hAnsi="Arial"/>
@@ -2457,7 +2457,7 @@
               <w:t xml:space="preserve">2.2.1.4</w:t>
             </w:r>
           </w:hyperlink>
-          <w:hyperlink w:anchor="_msglliqq2z1">
+          <w:hyperlink w:anchor="_hfdjvzadp2b5">
             <w:r>
               <w:rPr>
                 <w:rFonts w:ascii="Arial" w:cs="Arial" w:eastAsia="Arial" w:hAnsi="Arial"/>
@@ -2478,7 +2478,7 @@
           </w:hyperlink>
           <w:r>
             <w:fldChar w:fldCharType="begin"/>
-            <w:instrText xml:space="preserve"> PAGEREF _msglliqq2z1 \h </w:instrText>
+            <w:instrText xml:space="preserve"> PAGEREF _hfdjvzadp2b5 \h </w:instrText>
             <w:fldChar w:fldCharType="separate"/>
           </w:r>
           <w:r>
@@ -2544,7 +2544,7 @@
               <w:vertAlign w:val="baseline"/>
             </w:rPr>
           </w:pPr>
-          <w:hyperlink w:anchor="_drxc8yxq0kha">
+          <w:hyperlink w:anchor="_6kktwmxrmh0w">
             <w:r>
               <w:rPr>
                 <w:rFonts w:ascii="Arial" w:cs="Arial" w:eastAsia="Arial" w:hAnsi="Arial"/>
@@ -2563,7 +2563,7 @@
               <w:t xml:space="preserve">2.2.2</w:t>
             </w:r>
           </w:hyperlink>
-          <w:hyperlink w:anchor="_drxc8yxq0kha">
+          <w:hyperlink w:anchor="_6kktwmxrmh0w">
             <w:r>
               <w:rPr>
                 <w:rFonts w:ascii="Arial" w:cs="Arial" w:eastAsia="Arial" w:hAnsi="Arial"/>
@@ -2584,7 +2584,7 @@
           </w:hyperlink>
           <w:r>
             <w:fldChar w:fldCharType="begin"/>
-            <w:instrText xml:space="preserve"> PAGEREF _drxc8yxq0kha \h </w:instrText>
+            <w:instrText xml:space="preserve"> PAGEREF _6kktwmxrmh0w \h </w:instrText>
             <w:fldChar w:fldCharType="separate"/>
           </w:r>
           <w:r>
@@ -2650,7 +2650,7 @@
               <w:vertAlign w:val="baseline"/>
             </w:rPr>
           </w:pPr>
-          <w:hyperlink w:anchor="_m56ppffewdyy">
+          <w:hyperlink w:anchor="_4ocpxoff8wtq">
             <w:r>
               <w:rPr>
                 <w:rFonts w:ascii="Arial" w:cs="Arial" w:eastAsia="Arial" w:hAnsi="Arial"/>
@@ -2669,7 +2669,7 @@
               <w:t xml:space="preserve">2.2.2.1</w:t>
             </w:r>
           </w:hyperlink>
-          <w:hyperlink w:anchor="_m56ppffewdyy">
+          <w:hyperlink w:anchor="_4ocpxoff8wtq">
             <w:r>
               <w:rPr>
                 <w:rFonts w:ascii="Arial" w:cs="Arial" w:eastAsia="Arial" w:hAnsi="Arial"/>
@@ -2690,7 +2690,7 @@
           </w:hyperlink>
           <w:r>
             <w:fldChar w:fldCharType="begin"/>
-            <w:instrText xml:space="preserve"> PAGEREF _m56ppffewdyy \h </w:instrText>
+            <w:instrText xml:space="preserve"> PAGEREF _4ocpxoff8wtq \h </w:instrText>
             <w:fldChar w:fldCharType="separate"/>
           </w:r>
           <w:r>
@@ -2756,7 +2756,7 @@
               <w:vertAlign w:val="baseline"/>
             </w:rPr>
           </w:pPr>
-          <w:hyperlink w:anchor="_y8n5dpti3ll0">
+          <w:hyperlink w:anchor="_jk1k0fgw8gex">
             <w:r>
               <w:rPr>
                 <w:rFonts w:ascii="Arial" w:cs="Arial" w:eastAsia="Arial" w:hAnsi="Arial"/>
@@ -2775,7 +2775,7 @@
               <w:t xml:space="preserve">2.2.2.2</w:t>
             </w:r>
           </w:hyperlink>
-          <w:hyperlink w:anchor="_y8n5dpti3ll0">
+          <w:hyperlink w:anchor="_jk1k0fgw8gex">
             <w:r>
               <w:rPr>
                 <w:rFonts w:ascii="Arial" w:cs="Arial" w:eastAsia="Arial" w:hAnsi="Arial"/>
@@ -2796,7 +2796,7 @@
           </w:hyperlink>
           <w:r>
             <w:fldChar w:fldCharType="begin"/>
-            <w:instrText xml:space="preserve"> PAGEREF _y8n5dpti3ll0 \h </w:instrText>
+            <w:instrText xml:space="preserve"> PAGEREF _jk1k0fgw8gex \h </w:instrText>
             <w:fldChar w:fldCharType="separate"/>
           </w:r>
           <w:r>
@@ -2862,7 +2862,7 @@
               <w:vertAlign w:val="baseline"/>
             </w:rPr>
           </w:pPr>
-          <w:hyperlink w:anchor="_c1o5s2a5nwel">
+          <w:hyperlink w:anchor="_4nnfqvb8l8ec">
             <w:r>
               <w:rPr>
                 <w:rFonts w:ascii="Arial" w:cs="Arial" w:eastAsia="Arial" w:hAnsi="Arial"/>
@@ -2881,7 +2881,7 @@
               <w:t xml:space="preserve">2.2.2.3</w:t>
             </w:r>
           </w:hyperlink>
-          <w:hyperlink w:anchor="_c1o5s2a5nwel">
+          <w:hyperlink w:anchor="_4nnfqvb8l8ec">
             <w:r>
               <w:rPr>
                 <w:rFonts w:ascii="Arial" w:cs="Arial" w:eastAsia="Arial" w:hAnsi="Arial"/>
@@ -2902,7 +2902,7 @@
           </w:hyperlink>
           <w:r>
             <w:fldChar w:fldCharType="begin"/>
-            <w:instrText xml:space="preserve"> PAGEREF _c1o5s2a5nwel \h </w:instrText>
+            <w:instrText xml:space="preserve"> PAGEREF _4nnfqvb8l8ec \h </w:instrText>
             <w:fldChar w:fldCharType="separate"/>
           </w:r>
           <w:r>
@@ -2968,7 +2968,7 @@
               <w:vertAlign w:val="baseline"/>
             </w:rPr>
           </w:pPr>
-          <w:hyperlink w:anchor="_x8dsslbabknk">
+          <w:hyperlink w:anchor="_leyi41lt22tu">
             <w:r>
               <w:rPr>
                 <w:rFonts w:ascii="Arial" w:cs="Arial" w:eastAsia="Arial" w:hAnsi="Arial"/>
@@ -2987,7 +2987,7 @@
               <w:t xml:space="preserve">2.3</w:t>
             </w:r>
           </w:hyperlink>
-          <w:hyperlink w:anchor="_x8dsslbabknk">
+          <w:hyperlink w:anchor="_leyi41lt22tu">
             <w:r>
               <w:rPr>
                 <w:rFonts w:ascii="Arial" w:cs="Arial" w:eastAsia="Arial" w:hAnsi="Arial"/>
@@ -3008,7 +3008,7 @@
           </w:hyperlink>
           <w:r>
             <w:fldChar w:fldCharType="begin"/>
-            <w:instrText xml:space="preserve"> PAGEREF _x8dsslbabknk \h </w:instrText>
+            <w:instrText xml:space="preserve"> PAGEREF _leyi41lt22tu \h </w:instrText>
             <w:fldChar w:fldCharType="separate"/>
           </w:r>
           <w:r>
@@ -3074,7 +3074,7 @@
               <w:vertAlign w:val="baseline"/>
             </w:rPr>
           </w:pPr>
-          <w:hyperlink w:anchor="_3fp7fge911cv">
+          <w:hyperlink w:anchor="_dqg7o9c3902q">
             <w:r>
               <w:rPr>
                 <w:rFonts w:ascii="Arial" w:cs="Arial" w:eastAsia="Arial" w:hAnsi="Arial"/>
@@ -3095,7 +3095,7 @@
               <w:t xml:space="preserve">3</w:t>
             </w:r>
           </w:hyperlink>
-          <w:hyperlink w:anchor="_3fp7fge911cv">
+          <w:hyperlink w:anchor="_dqg7o9c3902q">
             <w:r>
               <w:rPr>
                 <w:rFonts w:ascii="Arial" w:cs="Arial" w:eastAsia="Arial" w:hAnsi="Arial"/>
@@ -3116,7 +3116,7 @@
           </w:hyperlink>
           <w:r>
             <w:fldChar w:fldCharType="begin"/>
-            <w:instrText xml:space="preserve"> PAGEREF _3fp7fge911cv \h </w:instrText>
+            <w:instrText xml:space="preserve"> PAGEREF _dqg7o9c3902q \h </w:instrText>
             <w:fldChar w:fldCharType="separate"/>
           </w:r>
           <w:r>
@@ -3184,7 +3184,7 @@
               <w:vertAlign w:val="baseline"/>
             </w:rPr>
           </w:pPr>
-          <w:hyperlink w:anchor="_w7whk0y0oy2y">
+          <w:hyperlink w:anchor="_z2nxdsbogpr">
             <w:r>
               <w:rPr>
                 <w:rFonts w:ascii="Arial" w:cs="Arial" w:eastAsia="Arial" w:hAnsi="Arial"/>
@@ -3203,7 +3203,7 @@
               <w:t xml:space="preserve">3.1</w:t>
             </w:r>
           </w:hyperlink>
-          <w:hyperlink w:anchor="_w7whk0y0oy2y">
+          <w:hyperlink w:anchor="_z2nxdsbogpr">
             <w:r>
               <w:rPr>
                 <w:rFonts w:ascii="Arial" w:cs="Arial" w:eastAsia="Arial" w:hAnsi="Arial"/>
@@ -3224,7 +3224,7 @@
           </w:hyperlink>
           <w:r>
             <w:fldChar w:fldCharType="begin"/>
-            <w:instrText xml:space="preserve"> PAGEREF _w7whk0y0oy2y \h </w:instrText>
+            <w:instrText xml:space="preserve"> PAGEREF _z2nxdsbogpr \h </w:instrText>
             <w:fldChar w:fldCharType="separate"/>
           </w:r>
           <w:r>
@@ -3290,7 +3290,7 @@
               <w:vertAlign w:val="baseline"/>
             </w:rPr>
           </w:pPr>
-          <w:hyperlink w:anchor="_l57bfw29q5sy">
+          <w:hyperlink w:anchor="_gtcj9wu54ht4">
             <w:r>
               <w:rPr>
                 <w:rFonts w:ascii="Arial" w:cs="Arial" w:eastAsia="Arial" w:hAnsi="Arial"/>
@@ -3309,7 +3309,7 @@
               <w:t xml:space="preserve">3.2</w:t>
             </w:r>
           </w:hyperlink>
-          <w:hyperlink w:anchor="_l57bfw29q5sy">
+          <w:hyperlink w:anchor="_gtcj9wu54ht4">
             <w:r>
               <w:rPr>
                 <w:rFonts w:ascii="Arial" w:cs="Arial" w:eastAsia="Arial" w:hAnsi="Arial"/>
@@ -3330,7 +3330,7 @@
           </w:hyperlink>
           <w:r>
             <w:fldChar w:fldCharType="begin"/>
-            <w:instrText xml:space="preserve"> PAGEREF _l57bfw29q5sy \h </w:instrText>
+            <w:instrText xml:space="preserve"> PAGEREF _gtcj9wu54ht4 \h </w:instrText>
             <w:fldChar w:fldCharType="separate"/>
           </w:r>
           <w:r>
@@ -3396,7 +3396,7 @@
               <w:vertAlign w:val="baseline"/>
             </w:rPr>
           </w:pPr>
-          <w:hyperlink w:anchor="_hlcno0nu7e4h">
+          <w:hyperlink w:anchor="_769tlw11um2f">
             <w:r>
               <w:rPr>
                 <w:rFonts w:ascii="Arial" w:cs="Arial" w:eastAsia="Arial" w:hAnsi="Arial"/>
@@ -3415,7 +3415,7 @@
               <w:t xml:space="preserve">3.3</w:t>
             </w:r>
           </w:hyperlink>
-          <w:hyperlink w:anchor="_hlcno0nu7e4h">
+          <w:hyperlink w:anchor="_769tlw11um2f">
             <w:r>
               <w:rPr>
                 <w:rFonts w:ascii="Arial" w:cs="Arial" w:eastAsia="Arial" w:hAnsi="Arial"/>
@@ -3436,7 +3436,7 @@
           </w:hyperlink>
           <w:r>
             <w:fldChar w:fldCharType="begin"/>
-            <w:instrText xml:space="preserve"> PAGEREF _hlcno0nu7e4h \h </w:instrText>
+            <w:instrText xml:space="preserve"> PAGEREF _769tlw11um2f \h </w:instrText>
             <w:fldChar w:fldCharType="separate"/>
           </w:r>
           <w:r>
@@ -3502,7 +3502,7 @@
               <w:vertAlign w:val="baseline"/>
             </w:rPr>
           </w:pPr>
-          <w:hyperlink w:anchor="_u0z7iu6uc0qc">
+          <w:hyperlink w:anchor="_441hvwtf2qkb">
             <w:r>
               <w:rPr>
                 <w:rFonts w:ascii="Arial" w:cs="Arial" w:eastAsia="Arial" w:hAnsi="Arial"/>
@@ -3523,7 +3523,7 @@
               <w:t xml:space="preserve">4</w:t>
             </w:r>
           </w:hyperlink>
-          <w:hyperlink w:anchor="_u0z7iu6uc0qc">
+          <w:hyperlink w:anchor="_441hvwtf2qkb">
             <w:r>
               <w:rPr>
                 <w:rFonts w:ascii="Arial" w:cs="Arial" w:eastAsia="Arial" w:hAnsi="Arial"/>
@@ -3544,7 +3544,7 @@
           </w:hyperlink>
           <w:r>
             <w:fldChar w:fldCharType="begin"/>
-            <w:instrText xml:space="preserve"> PAGEREF _u0z7iu6uc0qc \h </w:instrText>
+            <w:instrText xml:space="preserve"> PAGEREF _441hvwtf2qkb \h </w:instrText>
             <w:fldChar w:fldCharType="separate"/>
           </w:r>
           <w:r>
@@ -3612,7 +3612,7 @@
               <w:vertAlign w:val="baseline"/>
             </w:rPr>
           </w:pPr>
-          <w:hyperlink w:anchor="_netmp5hfzh5w">
+          <w:hyperlink w:anchor="_fr1yutmhiiny">
             <w:r>
               <w:rPr>
                 <w:rFonts w:ascii="Arial" w:cs="Arial" w:eastAsia="Arial" w:hAnsi="Arial"/>
@@ -3631,7 +3631,7 @@
               <w:t xml:space="preserve">4.1</w:t>
             </w:r>
           </w:hyperlink>
-          <w:hyperlink w:anchor="_netmp5hfzh5w">
+          <w:hyperlink w:anchor="_fr1yutmhiiny">
             <w:r>
               <w:rPr>
                 <w:rFonts w:ascii="Arial" w:cs="Arial" w:eastAsia="Arial" w:hAnsi="Arial"/>
@@ -3652,7 +3652,7 @@
           </w:hyperlink>
           <w:r>
             <w:fldChar w:fldCharType="begin"/>
-            <w:instrText xml:space="preserve"> PAGEREF _netmp5hfzh5w \h </w:instrText>
+            <w:instrText xml:space="preserve"> PAGEREF _fr1yutmhiiny \h </w:instrText>
             <w:fldChar w:fldCharType="separate"/>
           </w:r>
           <w:r>
@@ -3718,7 +3718,7 @@
               <w:vertAlign w:val="baseline"/>
             </w:rPr>
           </w:pPr>
-          <w:hyperlink w:anchor="_vytahvov7q30">
+          <w:hyperlink w:anchor="_8ou8q11votq3">
             <w:r>
               <w:rPr>
                 <w:rFonts w:ascii="Arial" w:cs="Arial" w:eastAsia="Arial" w:hAnsi="Arial"/>
@@ -3737,7 +3737,7 @@
               <w:t xml:space="preserve">4.1.1</w:t>
             </w:r>
           </w:hyperlink>
-          <w:hyperlink w:anchor="_vytahvov7q30">
+          <w:hyperlink w:anchor="_8ou8q11votq3">
             <w:r>
               <w:rPr>
                 <w:rFonts w:ascii="Arial" w:cs="Arial" w:eastAsia="Arial" w:hAnsi="Arial"/>
@@ -3758,7 +3758,7 @@
           </w:hyperlink>
           <w:r>
             <w:fldChar w:fldCharType="begin"/>
-            <w:instrText xml:space="preserve"> PAGEREF _vytahvov7q30 \h </w:instrText>
+            <w:instrText xml:space="preserve"> PAGEREF _8ou8q11votq3 \h </w:instrText>
             <w:fldChar w:fldCharType="separate"/>
           </w:r>
           <w:r>
@@ -3824,7 +3824,7 @@
               <w:vertAlign w:val="baseline"/>
             </w:rPr>
           </w:pPr>
-          <w:hyperlink w:anchor="_52pn71loctf1">
+          <w:hyperlink w:anchor="_q4si9mgoolx">
             <w:r>
               <w:rPr>
                 <w:rFonts w:ascii="Arial" w:cs="Arial" w:eastAsia="Arial" w:hAnsi="Arial"/>
@@ -3843,7 +3843,7 @@
               <w:t xml:space="preserve">4.1.2</w:t>
             </w:r>
           </w:hyperlink>
-          <w:hyperlink w:anchor="_52pn71loctf1">
+          <w:hyperlink w:anchor="_q4si9mgoolx">
             <w:r>
               <w:rPr>
                 <w:rFonts w:ascii="Arial" w:cs="Arial" w:eastAsia="Arial" w:hAnsi="Arial"/>
@@ -3864,7 +3864,7 @@
           </w:hyperlink>
           <w:r>
             <w:fldChar w:fldCharType="begin"/>
-            <w:instrText xml:space="preserve"> PAGEREF _52pn71loctf1 \h </w:instrText>
+            <w:instrText xml:space="preserve"> PAGEREF _q4si9mgoolx \h </w:instrText>
             <w:fldChar w:fldCharType="separate"/>
           </w:r>
           <w:r>
@@ -3930,7 +3930,7 @@
               <w:vertAlign w:val="baseline"/>
             </w:rPr>
           </w:pPr>
-          <w:hyperlink w:anchor="_bcmlszdnye84">
+          <w:hyperlink w:anchor="_gt8y3s7mayqu">
             <w:r>
               <w:rPr>
                 <w:rFonts w:ascii="Arial" w:cs="Arial" w:eastAsia="Arial" w:hAnsi="Arial"/>
@@ -3949,7 +3949,7 @@
               <w:t xml:space="preserve">4.2</w:t>
             </w:r>
           </w:hyperlink>
-          <w:hyperlink w:anchor="_bcmlszdnye84">
+          <w:hyperlink w:anchor="_gt8y3s7mayqu">
             <w:r>
               <w:rPr>
                 <w:rFonts w:ascii="Arial" w:cs="Arial" w:eastAsia="Arial" w:hAnsi="Arial"/>
@@ -3970,7 +3970,7 @@
           </w:hyperlink>
           <w:r>
             <w:fldChar w:fldCharType="begin"/>
-            <w:instrText xml:space="preserve"> PAGEREF _bcmlszdnye84 \h </w:instrText>
+            <w:instrText xml:space="preserve"> PAGEREF _gt8y3s7mayqu \h </w:instrText>
             <w:fldChar w:fldCharType="separate"/>
           </w:r>
           <w:r>
@@ -4036,7 +4036,7 @@
               <w:vertAlign w:val="baseline"/>
             </w:rPr>
           </w:pPr>
-          <w:hyperlink w:anchor="_crug6p9xjxkq">
+          <w:hyperlink w:anchor="_evsqjyu2egbq">
             <w:r>
               <w:rPr>
                 <w:rFonts w:ascii="Arial" w:cs="Arial" w:eastAsia="Arial" w:hAnsi="Arial"/>
@@ -4055,7 +4055,7 @@
               <w:t xml:space="preserve">4.2.1</w:t>
             </w:r>
           </w:hyperlink>
-          <w:hyperlink w:anchor="_crug6p9xjxkq">
+          <w:hyperlink w:anchor="_evsqjyu2egbq">
             <w:r>
               <w:rPr>
                 <w:rFonts w:ascii="Arial" w:cs="Arial" w:eastAsia="Arial" w:hAnsi="Arial"/>
@@ -4076,7 +4076,7 @@
           </w:hyperlink>
           <w:r>
             <w:fldChar w:fldCharType="begin"/>
-            <w:instrText xml:space="preserve"> PAGEREF _crug6p9xjxkq \h </w:instrText>
+            <w:instrText xml:space="preserve"> PAGEREF _evsqjyu2egbq \h </w:instrText>
             <w:fldChar w:fldCharType="separate"/>
           </w:r>
           <w:r>
@@ -4142,7 +4142,7 @@
               <w:vertAlign w:val="baseline"/>
             </w:rPr>
           </w:pPr>
-          <w:hyperlink w:anchor="_xuzejz4r36e7">
+          <w:hyperlink w:anchor="_b1j2g3xpw1ju">
             <w:r>
               <w:rPr>
                 <w:rFonts w:ascii="Arial" w:cs="Arial" w:eastAsia="Arial" w:hAnsi="Arial"/>
@@ -4161,7 +4161,7 @@
               <w:t xml:space="preserve">4.2.2</w:t>
             </w:r>
           </w:hyperlink>
-          <w:hyperlink w:anchor="_xuzejz4r36e7">
+          <w:hyperlink w:anchor="_b1j2g3xpw1ju">
             <w:r>
               <w:rPr>
                 <w:rFonts w:ascii="Arial" w:cs="Arial" w:eastAsia="Arial" w:hAnsi="Arial"/>
@@ -4182,7 +4182,7 @@
           </w:hyperlink>
           <w:r>
             <w:fldChar w:fldCharType="begin"/>
-            <w:instrText xml:space="preserve"> PAGEREF _xuzejz4r36e7 \h </w:instrText>
+            <w:instrText xml:space="preserve"> PAGEREF _b1j2g3xpw1ju \h </w:instrText>
             <w:fldChar w:fldCharType="separate"/>
           </w:r>
           <w:r>
@@ -4247,7 +4247,7 @@
               <w:vertAlign w:val="baseline"/>
             </w:rPr>
           </w:pPr>
-          <w:hyperlink w:anchor="_aqnqjjitv0lo">
+          <w:hyperlink w:anchor="_kobrd2o323bd">
             <w:r>
               <w:rPr>
                 <w:rFonts w:ascii="Arial" w:cs="Arial" w:eastAsia="Arial" w:hAnsi="Arial"/>
@@ -4310,7 +4310,7 @@
               <w:vertAlign w:val="baseline"/>
             </w:rPr>
           </w:pPr>
-          <w:hyperlink w:anchor="_agtknyi6bwqf">
+          <w:hyperlink w:anchor="_i03kvu451n53">
             <w:r>
               <w:rPr>
                 <w:rFonts w:ascii="Arial" w:cs="Arial" w:eastAsia="Arial" w:hAnsi="Arial"/>
@@ -4373,7 +4373,7 @@
               <w:vertAlign w:val="baseline"/>
             </w:rPr>
           </w:pPr>
-          <w:hyperlink w:anchor="_t7oggdnl7b2k">
+          <w:hyperlink w:anchor="_1489lz8920r9">
             <w:r>
               <w:rPr>
                 <w:rFonts w:ascii="Arial" w:cs="Arial" w:eastAsia="Arial" w:hAnsi="Arial"/>
@@ -4436,7 +4436,7 @@
               <w:vertAlign w:val="baseline"/>
             </w:rPr>
           </w:pPr>
-          <w:hyperlink w:anchor="_ud3jy1wlaghd">
+          <w:hyperlink w:anchor="_xisr2nertyts">
             <w:r>
               <w:rPr>
                 <w:rFonts w:ascii="Arial" w:cs="Arial" w:eastAsia="Arial" w:hAnsi="Arial"/>
@@ -4499,7 +4499,7 @@
               <w:vertAlign w:val="baseline"/>
             </w:rPr>
           </w:pPr>
-          <w:hyperlink w:anchor="_jkrbwn7e7aj3">
+          <w:hyperlink w:anchor="_86kqdzeoxl6q">
             <w:r>
               <w:rPr>
                 <w:rFonts w:ascii="Arial" w:cs="Arial" w:eastAsia="Arial" w:hAnsi="Arial"/>
@@ -4562,7 +4562,7 @@
               <w:vertAlign w:val="baseline"/>
             </w:rPr>
           </w:pPr>
-          <w:hyperlink w:anchor="_l7rcsn2dugwe">
+          <w:hyperlink w:anchor="_glk5yk9llptn">
             <w:r>
               <w:rPr>
                 <w:rFonts w:ascii="Arial" w:cs="Arial" w:eastAsia="Arial" w:hAnsi="Arial"/>
@@ -4625,7 +4625,7 @@
               <w:vertAlign w:val="baseline"/>
             </w:rPr>
           </w:pPr>
-          <w:hyperlink w:anchor="_kwddsnwfw0ic">
+          <w:hyperlink w:anchor="_iytv8dofr6o0">
             <w:r>
               <w:rPr>
                 <w:rFonts w:ascii="Arial" w:cs="Arial" w:eastAsia="Arial" w:hAnsi="Arial"/>
@@ -4686,7 +4686,7 @@
               <w:vertAlign w:val="baseline"/>
             </w:rPr>
           </w:pPr>
-          <w:hyperlink w:anchor="_31wjktbjuzuf">
+          <w:hyperlink w:anchor="_mygdlag4lumq">
             <w:r>
               <w:rPr>
                 <w:rFonts w:ascii="Arial" w:cs="Arial" w:eastAsia="Arial" w:hAnsi="Arial"/>
@@ -4766,7 +4766,7 @@
           <w:color w:val="231f20"/>
         </w:rPr>
       </w:pPr>
-      <w:bookmarkStart w:colFirst="0" w:colLast="0" w:name="_4i712jet9q63" w:id="1"/>
+      <w:bookmarkStart w:colFirst="0" w:colLast="0" w:name="_o53k9faklwsq" w:id="1"/>
       <w:bookmarkEnd w:id="1"/>
       <w:r>
         <w:rPr>
@@ -4787,7 +4787,7 @@
         <w:ind w:left="576" w:right="-4.724409448817823" w:hanging="576"/>
         <w:rPr/>
       </w:pPr>
-      <w:bookmarkStart w:colFirst="0" w:colLast="0" w:name="_8nxsjoqkwjqo" w:id="2"/>
+      <w:bookmarkStart w:colFirst="0" w:colLast="0" w:name="_plxk9fbxvnuq" w:id="2"/>
       <w:bookmarkEnd w:id="2"/>
       <w:r>
         <w:rPr>
@@ -4796,6 +4796,11 @@
           <w:rtl w:val="0"/>
         </w:rPr>
         <w:t xml:space="preserve">Placing the risk analysis in context</w:t>
+      </w:r>
+      <w:r>
+        <w:rPr>
+          <w:rtl w:val="0"/>
+        </w:rPr>
       </w:r>
     </w:p>
     <w:p>
@@ -4833,7 +4838,7 @@
         <w:ind w:left="576" w:right="-4.724409448817823" w:hanging="576"/>
         <w:rPr/>
       </w:pPr>
-      <w:bookmarkStart w:colFirst="0" w:colLast="0" w:name="_6fzxhec7xdn6" w:id="3"/>
+      <w:bookmarkStart w:colFirst="0" w:colLast="0" w:name="_g5fxrpoqf0b" w:id="3"/>
       <w:bookmarkEnd w:id="3"/>
       <w:r>
         <w:rPr>
@@ -4842,6 +4847,11 @@
           <w:rtl w:val="0"/>
         </w:rPr>
         <w:t xml:space="preserve">Aims of the document</w:t>
+      </w:r>
+      <w:r>
+        <w:rPr>
+          <w:rtl w:val="0"/>
+        </w:rPr>
       </w:r>
     </w:p>
     <w:p>
@@ -4905,7 +4915,7 @@
         <w:ind w:left="576" w:right="-4.724409448817823" w:hanging="576"/>
         <w:rPr/>
       </w:pPr>
-      <w:bookmarkStart w:colFirst="0" w:colLast="0" w:name="_p535f650dprb" w:id="4"/>
+      <w:bookmarkStart w:colFirst="0" w:colLast="0" w:name="_3zr1wby4tod" w:id="4"/>
       <w:bookmarkEnd w:id="4"/>
       <w:r>
         <w:rPr>
@@ -4914,6 +4924,11 @@
           <w:rtl w:val="0"/>
         </w:rPr>
         <w:t xml:space="preserve">References</w:t>
+      </w:r>
+      <w:r>
+        <w:rPr>
+          <w:rtl w:val="0"/>
+        </w:rPr>
       </w:r>
     </w:p>
     <w:p>
@@ -5043,7 +5058,7 @@
         <w:ind w:left="576" w:right="-4.724409448817823" w:hanging="576"/>
         <w:rPr/>
       </w:pPr>
-      <w:bookmarkStart w:colFirst="0" w:colLast="0" w:name="_qq7n3ylzfzyy" w:id="5"/>
+      <w:bookmarkStart w:colFirst="0" w:colLast="0" w:name="_9tfhh117be5o" w:id="5"/>
       <w:bookmarkEnd w:id="5"/>
       <w:r>
         <w:rPr>
@@ -5052,6 +5067,11 @@
           <w:rtl w:val="0"/>
         </w:rPr>
         <w:t xml:space="preserve">Acronyms/Glossary</w:t>
+      </w:r>
+      <w:r>
+        <w:rPr>
+          <w:rtl w:val="0"/>
+        </w:rPr>
       </w:r>
     </w:p>
     <w:p>
@@ -5216,7 +5236,7 @@
         <w:ind w:left="576" w:right="-4.724409448817823" w:hanging="576"/>
         <w:rPr/>
       </w:pPr>
-      <w:bookmarkStart w:colFirst="0" w:colLast="0" w:name="_8j81hqgtduzy" w:id="6"/>
+      <w:bookmarkStart w:colFirst="0" w:colLast="0" w:name="_3w7afet6jht" w:id="6"/>
       <w:bookmarkEnd w:id="6"/>
       <w:r>
         <w:rPr>
@@ -5226,6 +5246,11 @@
         </w:rPr>
         <w:t xml:space="preserve">Description of the “CASES Optimised Risk Analysis Method” (MONARC)</w:t>
       </w:r>
+      <w:r>
+        <w:rPr>
+          <w:rtl w:val="0"/>
+        </w:rPr>
+      </w:r>
     </w:p>
     <w:p>
       <w:pPr>
@@ -5257,494 +5282,89 @@
           <w:rtl w:val="0"/>
         </w:rPr>
       </w:r>
-    </w:p>
-    <w:p>
-      <w:pPr>
-        <w:ind w:right="-4.724409448817823"/>
-        <w:rPr>
-          <w:rFonts w:ascii="Arial" w:cs="Arial" w:eastAsia="Arial" w:hAnsi="Arial"/>
-          <w:color w:val="231f20"/>
-        </w:rPr>
-      </w:pPr>
-      <w:r>
-        <w:rPr>
-          <w:rtl w:val="0"/>
-        </w:rPr>
-      </w:r>
-      <w:r>
-        <mc:AlternateContent>
-          <mc:Choice Requires="wpg">
-            <w:drawing>
-              <wp:anchor allowOverlap="1" behindDoc="0" distB="114300" distT="114300" distL="114300" distR="114300" hidden="0" layoutInCell="1" locked="0" relativeHeight="0" simplePos="0">
-                <wp:simplePos x="0" y="0"/>
-                <wp:positionH relativeFrom="column">
-                  <wp:posOffset>1101637</wp:posOffset>
-                </wp:positionH>
-                <wp:positionV relativeFrom="paragraph">
-                  <wp:posOffset>209550</wp:posOffset>
-                </wp:positionV>
-                <wp:extent cx="4273868" cy="2807138"/>
-                <wp:effectExtent b="0" l="0" r="0" t="0"/>
-                <wp:wrapSquare wrapText="bothSides" distB="114300" distT="114300" distL="114300" distR="114300"/>
-                <wp:docPr id="2" name=""/>
-                <a:graphic>
-                  <a:graphicData uri="http://schemas.microsoft.com/office/word/2010/wordprocessingGroup">
-                    <wpg:wgp>
-                      <wpg:cNvGrpSpPr/>
-                      <wpg:grpSpPr>
-                        <a:xfrm>
-                          <a:off x="1680300" y="1164750"/>
-                          <a:ext cx="4273868" cy="2807138"/>
-                          <a:chOff x="1680300" y="1164750"/>
-                          <a:chExt cx="5783400" cy="3792600"/>
-                        </a:xfrm>
-                      </wpg:grpSpPr>
-                      <pic:pic>
-                        <pic:nvPicPr>
-                          <pic:cNvPr id="39" name="Shape 39"/>
-                          <pic:cNvPicPr preferRelativeResize="0"/>
-                        </pic:nvPicPr>
-                        <pic:blipFill rotWithShape="1">
-                          <a:blip r:embed="rId8">
-                            <a:alphaModFix/>
-                          </a:blip>
-                          <a:srcRect b="8793" l="0" r="0" t="8801"/>
-                          <a:stretch/>
-                        </pic:blipFill>
-                        <pic:spPr>
-                          <a:xfrm>
-                            <a:off x="2546323" y="1372541"/>
-                            <a:ext cx="4020501" cy="3366799"/>
-                          </a:xfrm>
-                          <a:prstGeom prst="rect">
-                            <a:avLst/>
-                          </a:prstGeom>
-                          <a:noFill/>
-                          <a:ln>
-                            <a:noFill/>
-                          </a:ln>
-                        </pic:spPr>
-                      </pic:pic>
-                      <wps:wsp>
-                        <wps:cNvSpPr/>
-                        <wps:cNvPr id="40" name="Shape 40"/>
-                        <wps:spPr>
-                          <a:xfrm>
-                            <a:off x="3608100" y="1164750"/>
-                            <a:ext cx="1927800" cy="893700"/>
-                          </a:xfrm>
-                          <a:prstGeom prst="roundRect">
-                            <a:avLst>
-                              <a:gd fmla="val 16667" name="adj"/>
-                            </a:avLst>
-                          </a:prstGeom>
-                          <a:solidFill>
-                            <a:srgbClr val="2FA36B"/>
-                          </a:solidFill>
-                          <a:ln>
-                            <a:noFill/>
-                          </a:ln>
-                        </wps:spPr>
-                        <wps:txbx>
-                          <w:txbxContent>
-                            <w:p>
-                              <w:pPr>
-                                <w:spacing w:after="0" w:before="0" w:line="240"/>
-                                <w:ind w:left="0" w:right="0" w:firstLine="0"/>
-                                <w:jc w:val="center"/>
-                                <w:textDirection w:val="btLr"/>
-                              </w:pPr>
-                            </w:p>
-                          </w:txbxContent>
-                        </wps:txbx>
-                        <wps:bodyPr anchorCtr="0" anchor="ctr" bIns="91425" lIns="91425" spcFirstLastPara="1" rIns="91425" wrap="square" tIns="91425">
-                          <a:noAutofit/>
-                        </wps:bodyPr>
-                      </wps:wsp>
-                      <wps:wsp>
-                        <wps:cNvSpPr/>
-                        <wps:cNvPr id="41" name="Shape 41"/>
-                        <wps:spPr>
-                          <a:xfrm>
-                            <a:off x="1680300" y="2614200"/>
-                            <a:ext cx="1927800" cy="893700"/>
-                          </a:xfrm>
-                          <a:prstGeom prst="roundRect">
-                            <a:avLst>
-                              <a:gd fmla="val 16667" name="adj"/>
-                            </a:avLst>
-                          </a:prstGeom>
-                          <a:solidFill>
-                            <a:srgbClr val="C0392B"/>
-                          </a:solidFill>
-                          <a:ln>
-                            <a:noFill/>
-                          </a:ln>
-                        </wps:spPr>
-                        <wps:txbx>
-                          <w:txbxContent>
-                            <w:p>
-                              <w:pPr>
-                                <w:spacing w:after="0" w:before="0" w:line="240"/>
-                                <w:ind w:left="0" w:right="0" w:firstLine="0"/>
-                                <w:jc w:val="center"/>
-                                <w:textDirection w:val="btLr"/>
-                              </w:pPr>
-                            </w:p>
-                          </w:txbxContent>
-                        </wps:txbx>
-                        <wps:bodyPr anchorCtr="0" anchor="ctr" bIns="91425" lIns="91425" spcFirstLastPara="1" rIns="91425" wrap="square" tIns="91425">
-                          <a:noAutofit/>
-                        </wps:bodyPr>
-                      </wps:wsp>
-                      <wps:wsp>
-                        <wps:cNvSpPr txBox="1"/>
-                        <wps:cNvPr id="42" name="Shape 42"/>
-                        <wps:spPr>
-                          <a:xfrm>
-                            <a:off x="3730188" y="1275200"/>
-                            <a:ext cx="1683600" cy="615600"/>
-                          </a:xfrm>
-                          <a:prstGeom prst="rect">
-                            <a:avLst/>
-                          </a:prstGeom>
-                          <a:noFill/>
-                          <a:ln>
-                            <a:noFill/>
-                          </a:ln>
-                        </wps:spPr>
-                        <wps:txbx>
-                          <w:txbxContent>
-                            <w:p>
-                              <w:pPr>
-                                <w:spacing w:after="0" w:before="0" w:line="240"/>
-                                <w:ind w:left="0" w:right="0" w:firstLine="0"/>
-                                <w:jc w:val="center"/>
-                                <w:textDirection w:val="btLr"/>
-                              </w:pPr>
-                              <w:r>
-                                <w:rPr>
-                                  <w:rFonts w:ascii="Arial" w:cs="Arial" w:eastAsia="Arial" w:hAnsi="Arial"/>
-                                  <w:b w:val="1"/>
-                                  <w:i w:val="0"/>
-                                  <w:smallCaps w:val="0"/>
-                                  <w:strike w:val="0"/>
-                                  <w:color w:val="ffffff"/>
-                                  <w:sz w:val="28"/>
-                                  <w:vertAlign w:val="baseline"/>
-                                </w:rPr>
-                                <w:t xml:space="preserve">Context establishment</w:t>
-                              </w:r>
-                            </w:p>
-                          </w:txbxContent>
-                        </wps:txbx>
-                        <wps:bodyPr anchorCtr="0" anchor="t" bIns="91425" lIns="91425" spcFirstLastPara="1" rIns="91425" wrap="square" tIns="91425">
-                          <a:spAutoFit/>
-                        </wps:bodyPr>
-                      </wps:wsp>
-                      <wps:wsp>
-                        <wps:cNvSpPr/>
-                        <wps:cNvPr id="43" name="Shape 43"/>
-                        <wps:spPr>
-                          <a:xfrm>
-                            <a:off x="5535900" y="2614200"/>
-                            <a:ext cx="1927800" cy="893700"/>
-                          </a:xfrm>
-                          <a:prstGeom prst="roundRect">
-                            <a:avLst>
-                              <a:gd fmla="val 16667" name="adj"/>
-                            </a:avLst>
-                          </a:prstGeom>
-                          <a:solidFill>
-                            <a:srgbClr val="2C8CA3"/>
-                          </a:solidFill>
-                          <a:ln>
-                            <a:noFill/>
-                          </a:ln>
-                        </wps:spPr>
-                        <wps:txbx>
-                          <w:txbxContent>
-                            <w:p>
-                              <w:pPr>
-                                <w:spacing w:after="0" w:before="0" w:line="240"/>
-                                <w:ind w:left="0" w:right="0" w:firstLine="0"/>
-                                <w:jc w:val="center"/>
-                                <w:textDirection w:val="btLr"/>
-                              </w:pPr>
-                            </w:p>
-                          </w:txbxContent>
-                        </wps:txbx>
-                        <wps:bodyPr anchorCtr="0" anchor="ctr" bIns="91425" lIns="91425" spcFirstLastPara="1" rIns="91425" wrap="square" tIns="91425">
-                          <a:noAutofit/>
-                        </wps:bodyPr>
-                      </wps:wsp>
-                      <wps:wsp>
-                        <wps:cNvSpPr/>
-                        <wps:cNvPr id="44" name="Shape 44"/>
-                        <wps:spPr>
-                          <a:xfrm>
-                            <a:off x="3608100" y="4063650"/>
-                            <a:ext cx="1927800" cy="893700"/>
-                          </a:xfrm>
-                          <a:prstGeom prst="roundRect">
-                            <a:avLst>
-                              <a:gd fmla="val 16667" name="adj"/>
-                            </a:avLst>
-                          </a:prstGeom>
-                          <a:solidFill>
-                            <a:srgbClr val="F1B800"/>
-                          </a:solidFill>
-                          <a:ln>
-                            <a:noFill/>
-                          </a:ln>
-                        </wps:spPr>
-                        <wps:txbx>
-                          <w:txbxContent>
-                            <w:p>
-                              <w:pPr>
-                                <w:spacing w:after="0" w:before="0" w:line="240"/>
-                                <w:ind w:left="0" w:right="0" w:firstLine="0"/>
-                                <w:jc w:val="center"/>
-                                <w:textDirection w:val="btLr"/>
-                              </w:pPr>
-                            </w:p>
-                          </w:txbxContent>
-                        </wps:txbx>
-                        <wps:bodyPr anchorCtr="0" anchor="ctr" bIns="91425" lIns="91425" spcFirstLastPara="1" rIns="91425" wrap="square" tIns="91425">
-                          <a:noAutofit/>
-                        </wps:bodyPr>
-                      </wps:wsp>
-                      <pic:pic>
-                        <pic:nvPicPr>
-                          <pic:cNvPr id="45" name="Shape 45"/>
-                          <pic:cNvPicPr preferRelativeResize="0"/>
-                        </pic:nvPicPr>
-                        <pic:blipFill>
-                          <a:blip r:embed="rId9">
-                            <a:alphaModFix/>
-                          </a:blip>
-                          <a:stretch>
-                            <a:fillRect/>
-                          </a:stretch>
-                        </pic:blipFill>
-                        <pic:spPr>
-                          <a:xfrm>
-                            <a:off x="3814586" y="2313450"/>
-                            <a:ext cx="1514826" cy="1495199"/>
-                          </a:xfrm>
-                          <a:prstGeom prst="rect">
-                            <a:avLst/>
-                          </a:prstGeom>
-                          <a:noFill/>
-                          <a:ln>
-                            <a:noFill/>
-                          </a:ln>
-                        </pic:spPr>
-                      </pic:pic>
-                      <wps:wsp>
-                        <wps:cNvSpPr txBox="1"/>
-                        <wps:cNvPr id="46" name="Shape 46"/>
-                        <wps:spPr>
-                          <a:xfrm>
-                            <a:off x="5657988" y="2753250"/>
-                            <a:ext cx="1683600" cy="615600"/>
-                          </a:xfrm>
-                          <a:prstGeom prst="rect">
-                            <a:avLst/>
-                          </a:prstGeom>
-                          <a:noFill/>
-                          <a:ln>
-                            <a:noFill/>
-                          </a:ln>
-                        </wps:spPr>
-                        <wps:txbx>
-                          <w:txbxContent>
-                            <w:p>
-                              <w:pPr>
-                                <w:spacing w:after="0" w:before="0" w:line="240"/>
-                                <w:ind w:left="0" w:right="0" w:firstLine="0"/>
-                                <w:jc w:val="center"/>
-                                <w:textDirection w:val="btLr"/>
-                              </w:pPr>
-                              <w:r>
-                                <w:rPr>
-                                  <w:rFonts w:ascii="Arial" w:cs="Arial" w:eastAsia="Arial" w:hAnsi="Arial"/>
-                                  <w:b w:val="1"/>
-                                  <w:i w:val="0"/>
-                                  <w:smallCaps w:val="0"/>
-                                  <w:strike w:val="0"/>
-                                  <w:color w:val="ffffff"/>
-                                  <w:sz w:val="28"/>
-                                  <w:vertAlign w:val="baseline"/>
-                                </w:rPr>
-                                <w:t xml:space="preserve">Context modelling</w:t>
-                              </w:r>
-                            </w:p>
-                          </w:txbxContent>
-                        </wps:txbx>
-                        <wps:bodyPr anchorCtr="0" anchor="t" bIns="91425" lIns="91425" spcFirstLastPara="1" rIns="91425" wrap="square" tIns="91425">
-                          <a:spAutoFit/>
-                        </wps:bodyPr>
-                      </wps:wsp>
-                      <wps:wsp>
-                        <wps:cNvSpPr txBox="1"/>
-                        <wps:cNvPr id="47" name="Shape 47"/>
-                        <wps:spPr>
-                          <a:xfrm>
-                            <a:off x="3730175" y="4186500"/>
-                            <a:ext cx="1683600" cy="648000"/>
-                          </a:xfrm>
-                          <a:prstGeom prst="rect">
-                            <a:avLst/>
-                          </a:prstGeom>
-                          <a:noFill/>
-                          <a:ln>
-                            <a:noFill/>
-                          </a:ln>
-                        </wps:spPr>
-                        <wps:txbx>
-                          <w:txbxContent>
-                            <w:p>
-                              <w:pPr>
-                                <w:spacing w:after="80" w:before="280" w:line="275.9999942779541"/>
-                                <w:ind w:left="0" w:right="0" w:firstLine="0"/>
-                                <w:jc w:val="center"/>
-                                <w:textDirection w:val="btLr"/>
-                              </w:pPr>
-                              <w:r>
-                                <w:rPr>
-                                  <w:rFonts w:ascii="Arial" w:cs="Arial" w:eastAsia="Arial" w:hAnsi="Arial"/>
-                                  <w:b w:val="1"/>
-                                  <w:i w:val="0"/>
-                                  <w:smallCaps w:val="0"/>
-                                  <w:strike w:val="0"/>
-                                  <w:color w:val="ffffff"/>
-                                  <w:sz w:val="28"/>
-                                  <w:vertAlign w:val="baseline"/>
-                                </w:rPr>
-                                <w:t xml:space="preserve">Evaluation and treatment of risks</w:t>
-                              </w:r>
-                            </w:p>
-                          </w:txbxContent>
-                        </wps:txbx>
-                        <wps:bodyPr anchorCtr="0" anchor="t" bIns="91425" lIns="91425" spcFirstLastPara="1" rIns="91425" wrap="square" tIns="91425">
-                          <a:spAutoFit/>
-                        </wps:bodyPr>
-                      </wps:wsp>
-                      <wps:wsp>
-                        <wps:cNvSpPr txBox="1"/>
-                        <wps:cNvPr id="48" name="Shape 48"/>
-                        <wps:spPr>
-                          <a:xfrm>
-                            <a:off x="1834193" y="2723373"/>
-                            <a:ext cx="1631700" cy="675600"/>
-                          </a:xfrm>
-                          <a:prstGeom prst="rect">
-                            <a:avLst/>
-                          </a:prstGeom>
-                          <a:noFill/>
-                          <a:ln>
-                            <a:noFill/>
-                          </a:ln>
-                        </wps:spPr>
-                        <wps:txbx>
-                          <w:txbxContent>
-                            <w:p>
-                              <w:pPr>
-                                <w:spacing w:after="80" w:before="280" w:line="275.9999942779541"/>
-                                <w:ind w:left="0" w:right="0" w:firstLine="0"/>
-                                <w:jc w:val="center"/>
-                                <w:textDirection w:val="btLr"/>
-                              </w:pPr>
-                              <w:r>
-                                <w:rPr>
-                                  <w:rFonts w:ascii="Arial" w:cs="Arial" w:eastAsia="Arial" w:hAnsi="Arial"/>
-                                  <w:b w:val="1"/>
-                                  <w:i w:val="0"/>
-                                  <w:smallCaps w:val="0"/>
-                                  <w:strike w:val="0"/>
-                                  <w:color w:val="ffffff"/>
-                                  <w:sz w:val="28"/>
-                                  <w:vertAlign w:val="baseline"/>
-                                </w:rPr>
-                                <w:t xml:space="preserve">Implementation and monitoring</w:t>
-                              </w:r>
-                            </w:p>
-                            <w:p>
-                              <w:pPr>
-                                <w:spacing w:after="0" w:before="0" w:line="240"/>
-                                <w:ind w:left="0" w:right="0" w:firstLine="0"/>
-                                <w:jc w:val="center"/>
-                                <w:textDirection w:val="btLr"/>
-                              </w:pPr>
-                              <w:r>
-                                <w:rPr>
-                                  <w:rFonts w:ascii="Arial" w:cs="Arial" w:eastAsia="Arial" w:hAnsi="Arial"/>
-                                  <w:b w:val="1"/>
-                                  <w:i w:val="0"/>
-                                  <w:smallCaps w:val="0"/>
-                                  <w:strike w:val="0"/>
-                                  <w:color w:val="ffffff"/>
-                                  <w:sz w:val="28"/>
-                                  <w:vertAlign w:val="baseline"/>
-                                </w:rPr>
-                              </w:r>
-                            </w:p>
-                          </w:txbxContent>
-                        </wps:txbx>
-                        <wps:bodyPr anchorCtr="0" anchor="t" bIns="91425" lIns="91425" spcFirstLastPara="1" rIns="91425" wrap="square" tIns="91425">
-                          <a:noAutofit/>
-                        </wps:bodyPr>
-                      </wps:wsp>
-                    </wpg:wgp>
-                  </a:graphicData>
-                </a:graphic>
-              </wp:anchor>
-            </w:drawing>
-          </mc:Choice>
-          <mc:Fallback>
-            <w:drawing>
-              <wp:anchor allowOverlap="1" behindDoc="0" distB="114300" distT="114300" distL="114300" distR="114300" hidden="0" layoutInCell="1" locked="0" relativeHeight="0" simplePos="0">
-                <wp:simplePos x="0" y="0"/>
-                <wp:positionH relativeFrom="column">
-                  <wp:posOffset>1101637</wp:posOffset>
-                </wp:positionH>
-                <wp:positionV relativeFrom="paragraph">
-                  <wp:posOffset>209550</wp:posOffset>
-                </wp:positionV>
-                <wp:extent cx="4273868" cy="2807138"/>
-                <wp:effectExtent b="0" l="0" r="0" t="0"/>
-                <wp:wrapSquare wrapText="bothSides" distB="114300" distT="114300" distL="114300" distR="114300"/>
-                <wp:docPr id="2" name="image5.png"/>
-                <a:graphic>
-                  <a:graphicData uri="http://schemas.openxmlformats.org/drawingml/2006/picture">
-                    <pic:pic>
-                      <pic:nvPicPr>
-                        <pic:cNvPr id="0" name="image5.png"/>
-                        <pic:cNvPicPr preferRelativeResize="0"/>
-                      </pic:nvPicPr>
-                      <pic:blipFill>
-                        <a:blip r:embed="rId10"/>
-                        <a:srcRect/>
-                        <a:stretch>
-                          <a:fillRect/>
-                        </a:stretch>
-                      </pic:blipFill>
-                      <pic:spPr>
-                        <a:xfrm>
-                          <a:off x="0" y="0"/>
-                          <a:ext cx="4273868" cy="2807138"/>
-                        </a:xfrm>
-                        <a:prstGeom prst="rect"/>
-                        <a:ln/>
-                      </pic:spPr>
-                    </pic:pic>
-                  </a:graphicData>
-                </a:graphic>
-              </wp:anchor>
-            </w:drawing>
-          </mc:Fallback>
-        </mc:AlternateContent>
+      <w:r>
+        <w:drawing>
+          <wp:anchor allowOverlap="1" behindDoc="0" distB="114300" distT="114300" distL="114300" distR="114300" hidden="0" layoutInCell="1" locked="0" relativeHeight="0" simplePos="0">
+            <wp:simplePos x="0" y="0"/>
+            <wp:positionH relativeFrom="column">
+              <wp:posOffset>744450</wp:posOffset>
+            </wp:positionH>
+            <wp:positionV relativeFrom="paragraph">
+              <wp:posOffset>172734</wp:posOffset>
+            </wp:positionV>
+            <wp:extent cx="4994705" cy="3306019"/>
+            <wp:effectExtent b="0" l="0" r="0" t="0"/>
+            <wp:wrapSquare wrapText="bothSides" distB="114300" distT="114300" distL="114300" distR="114300"/>
+            <wp:docPr id="8" name="image5.png"/>
+            <a:graphic>
+              <a:graphicData uri="http://schemas.openxmlformats.org/drawingml/2006/picture">
+                <pic:pic>
+                  <pic:nvPicPr>
+                    <pic:cNvPr id="0" name="image5.png"/>
+                    <pic:cNvPicPr preferRelativeResize="0"/>
+                  </pic:nvPicPr>
+                  <pic:blipFill>
+                    <a:blip r:embed="rId8"/>
+                    <a:srcRect b="0" l="0" r="0" t="0"/>
+                    <a:stretch>
+                      <a:fillRect/>
+                    </a:stretch>
+                  </pic:blipFill>
+                  <pic:spPr>
+                    <a:xfrm>
+                      <a:off x="0" y="0"/>
+                      <a:ext cx="4994705" cy="3306019"/>
+                    </a:xfrm>
+                    <a:prstGeom prst="rect"/>
+                    <a:ln/>
+                  </pic:spPr>
+                </pic:pic>
+              </a:graphicData>
+            </a:graphic>
+          </wp:anchor>
+        </w:drawing>
+      </w:r>
+    </w:p>
+    <w:p>
+      <w:pPr>
+        <w:ind w:right="-4.724409448817823"/>
+        <w:rPr>
+          <w:rFonts w:ascii="Arial" w:cs="Arial" w:eastAsia="Arial" w:hAnsi="Arial"/>
+          <w:color w:val="231f20"/>
+        </w:rPr>
+      </w:pPr>
+      <w:r>
+        <w:rPr>
+          <w:rtl w:val="0"/>
+        </w:rPr>
+      </w:r>
+    </w:p>
+    <w:p>
+      <w:pPr>
+        <w:ind w:right="-4.724409448817823"/>
+        <w:rPr>
+          <w:rFonts w:ascii="Arial" w:cs="Arial" w:eastAsia="Arial" w:hAnsi="Arial"/>
+          <w:color w:val="231f20"/>
+        </w:rPr>
+      </w:pPr>
+      <w:r>
+        <w:rPr>
+          <w:rtl w:val="0"/>
+        </w:rPr>
+      </w:r>
+    </w:p>
+    <w:p>
+      <w:pPr>
+        <w:ind w:right="-4.724409448817823"/>
+        <w:rPr>
+          <w:rFonts w:ascii="Arial" w:cs="Arial" w:eastAsia="Arial" w:hAnsi="Arial"/>
+          <w:color w:val="231f20"/>
+        </w:rPr>
+      </w:pPr>
+      <w:r>
+        <w:rPr>
+          <w:rtl w:val="0"/>
+        </w:rPr>
       </w:r>
     </w:p>
     <w:p>
@@ -5915,22 +5535,7 @@
     <w:p>
       <w:pPr>
         <w:ind w:right="-4.724409448817823"/>
-        <w:jc w:val="center"/>
-        <w:rPr>
-          <w:rFonts w:ascii="Arial" w:cs="Arial" w:eastAsia="Arial" w:hAnsi="Arial"/>
-          <w:color w:val="231f20"/>
-        </w:rPr>
-      </w:pPr>
-      <w:r>
-        <w:rPr>
-          <w:rtl w:val="0"/>
-        </w:rPr>
-      </w:r>
-    </w:p>
-    <w:p>
-      <w:pPr>
-        <w:ind w:right="-4.724409448817823"/>
-        <w:jc w:val="center"/>
+        <w:jc w:val="left"/>
         <w:rPr>
           <w:rFonts w:ascii="Arial" w:cs="Arial" w:eastAsia="Arial" w:hAnsi="Arial"/>
           <w:color w:val="231f20"/>
@@ -6027,1440 +5632,38 @@
           <w:rFonts w:ascii="Arial" w:cs="Arial" w:eastAsia="Arial" w:hAnsi="Arial"/>
           <w:color w:val="231f20"/>
         </w:rPr>
-        <mc:AlternateContent>
-          <mc:Choice Requires="wpg">
-            <w:drawing>
-              <wp:inline distB="114300" distT="114300" distL="114300" distR="114300">
-                <wp:extent cx="6370316" cy="5248380"/>
-                <wp:effectExtent b="0" l="0" r="0" t="0"/>
-                <wp:docPr id="1" name=""/>
-                <a:graphic>
-                  <a:graphicData uri="http://schemas.microsoft.com/office/word/2010/wordprocessingGroup">
-                    <wpg:wgp>
-                      <wpg:cNvGrpSpPr/>
-                      <wpg:grpSpPr>
-                        <a:xfrm>
-                          <a:off x="597850" y="255400"/>
-                          <a:ext cx="6370316" cy="5248380"/>
-                          <a:chOff x="597850" y="255400"/>
-                          <a:chExt cx="7836175" cy="6451600"/>
-                        </a:xfrm>
-                      </wpg:grpSpPr>
-                      <wps:wsp>
-                        <wps:cNvCnPr/>
-                        <wps:spPr>
-                          <a:xfrm flipH="1" rot="10800000">
-                            <a:off x="4694575" y="1580800"/>
-                            <a:ext cx="20100" cy="40200"/>
-                          </a:xfrm>
-                          <a:prstGeom prst="straightConnector1">
-                            <a:avLst/>
-                          </a:prstGeom>
-                          <a:noFill/>
-                          <a:ln cap="flat" cmpd="sng" w="9525">
-                            <a:solidFill>
-                              <a:srgbClr val="000000"/>
-                            </a:solidFill>
-                            <a:prstDash val="dot"/>
-                            <a:round/>
-                            <a:headEnd len="med" w="med" type="none"/>
-                            <a:tailEnd len="med" w="med" type="none"/>
-                          </a:ln>
-                        </wps:spPr>
-                        <wps:bodyPr anchorCtr="0" anchor="ctr" bIns="91425" lIns="91425" spcFirstLastPara="1" rIns="91425" wrap="square" tIns="91425">
-                          <a:noAutofit/>
-                        </wps:bodyPr>
-                      </wps:wsp>
-                      <wpg:grpSp>
-                        <wpg:cNvGrpSpPr/>
-                        <wpg:grpSpPr>
-                          <a:xfrm>
-                            <a:off x="597850" y="255425"/>
-                            <a:ext cx="7821825" cy="1580175"/>
-                            <a:chOff x="883600" y="522125"/>
-                            <a:chExt cx="7821825" cy="1580175"/>
-                          </a:xfrm>
-                        </wpg:grpSpPr>
-                        <wps:wsp>
-                          <wps:cNvSpPr/>
-                          <wps:cNvPr id="4" name="Shape 4"/>
-                          <wps:spPr>
-                            <a:xfrm>
-                              <a:off x="883600" y="522125"/>
-                              <a:ext cx="1921125" cy="1525750"/>
-                            </a:xfrm>
-                            <a:prstGeom prst="flowChartOffpageConnector">
-                              <a:avLst/>
-                            </a:prstGeom>
-                            <a:solidFill>
-                              <a:srgbClr val="2FA36B"/>
-                            </a:solidFill>
-                            <a:ln>
-                              <a:noFill/>
-                            </a:ln>
-                          </wps:spPr>
-                          <wps:txbx>
-                            <w:txbxContent>
-                              <w:p>
-                                <w:pPr>
-                                  <w:spacing w:after="0" w:before="0" w:line="240"/>
-                                  <w:ind w:left="0" w:right="0" w:firstLine="0"/>
-                                  <w:jc w:val="center"/>
-                                  <w:textDirection w:val="btLr"/>
-                                </w:pPr>
-                              </w:p>
-                            </w:txbxContent>
-                          </wps:txbx>
-                          <wps:bodyPr anchorCtr="0" anchor="ctr" bIns="91425" lIns="91425" spcFirstLastPara="1" rIns="91425" wrap="square" tIns="91425">
-                            <a:noAutofit/>
-                          </wps:bodyPr>
-                        </wps:wsp>
-                        <wps:wsp>
-                          <wps:cNvSpPr/>
-                          <wps:cNvPr id="5" name="Shape 5"/>
-                          <wps:spPr>
-                            <a:xfrm>
-                              <a:off x="2804725" y="532175"/>
-                              <a:ext cx="5900700" cy="1215000"/>
-                            </a:xfrm>
-                            <a:prstGeom prst="roundRect">
-                              <a:avLst>
-                                <a:gd fmla="val 0" name="adj"/>
-                              </a:avLst>
-                            </a:prstGeom>
-                            <a:noFill/>
-                            <a:ln cap="flat" cmpd="sng" w="9525">
-                              <a:solidFill>
-                                <a:srgbClr val="2FA36B"/>
-                              </a:solidFill>
-                              <a:prstDash val="solid"/>
-                              <a:round/>
-                              <a:headEnd len="sm" w="sm" type="none"/>
-                              <a:tailEnd len="sm" w="sm" type="none"/>
-                            </a:ln>
-                          </wps:spPr>
-                          <wps:txbx>
-                            <w:txbxContent>
-                              <w:p>
-                                <w:pPr>
-                                  <w:spacing w:after="0" w:before="0" w:line="240"/>
-                                  <w:ind w:left="0" w:right="0" w:firstLine="0"/>
-                                  <w:jc w:val="center"/>
-                                  <w:textDirection w:val="btLr"/>
-                                </w:pPr>
-                              </w:p>
-                            </w:txbxContent>
-                          </wps:txbx>
-                          <wps:bodyPr anchorCtr="0" anchor="ctr" bIns="91425" lIns="91425" spcFirstLastPara="1" rIns="91425" wrap="square" tIns="91425">
-                            <a:noAutofit/>
-                          </wps:bodyPr>
-                        </wps:wsp>
-                        <wps:wsp>
-                          <wps:cNvSpPr txBox="1"/>
-                          <wps:cNvPr id="6" name="Shape 6"/>
-                          <wps:spPr>
-                            <a:xfrm>
-                              <a:off x="2911882" y="632582"/>
-                              <a:ext cx="5683200" cy="1024200"/>
-                            </a:xfrm>
-                            <a:prstGeom prst="rect">
-                              <a:avLst/>
-                            </a:prstGeom>
-                            <a:noFill/>
-                            <a:ln>
-                              <a:noFill/>
-                            </a:ln>
-                          </wps:spPr>
-                          <wps:txbx>
-                            <w:txbxContent>
-                              <w:p>
-                                <w:pPr>
-                                  <w:spacing w:after="0" w:before="0" w:line="240"/>
-                                  <w:ind w:left="720" w:right="0" w:firstLine="360"/>
-                                  <w:jc w:val="left"/>
-                                  <w:textDirection w:val="btLr"/>
-                                </w:pPr>
-                                <w:r>
-                                  <w:rPr>
-                                    <w:rFonts w:ascii="Arial" w:cs="Arial" w:eastAsia="Arial" w:hAnsi="Arial"/>
-                                    <w:b w:val="0"/>
-                                    <w:i w:val="0"/>
-                                    <w:smallCaps w:val="0"/>
-                                    <w:strike w:val="0"/>
-                                    <w:color w:val="231f20"/>
-                                    <w:sz w:val="28"/>
-                                    <w:vertAlign w:val="baseline"/>
-                                  </w:rPr>
-                                  <w:t xml:space="preserve">Risks analysis context</w:t>
-                                </w:r>
-                              </w:p>
-                              <w:p>
-                                <w:pPr>
-                                  <w:spacing w:after="0" w:before="0" w:line="240"/>
-                                  <w:ind w:left="720" w:right="0" w:firstLine="360"/>
-                                  <w:jc w:val="left"/>
-                                  <w:textDirection w:val="btLr"/>
-                                </w:pPr>
-                                <w:r>
-                                  <w:rPr>
-                                    <w:rFonts w:ascii="Arial" w:cs="Arial" w:eastAsia="Arial" w:hAnsi="Arial"/>
-                                    <w:b w:val="0"/>
-                                    <w:i w:val="0"/>
-                                    <w:smallCaps w:val="0"/>
-                                    <w:strike w:val="0"/>
-                                    <w:color w:val="231f20"/>
-                                    <w:sz w:val="28"/>
-                                    <w:vertAlign w:val="baseline"/>
-                                  </w:rPr>
-                                </w:r>
-                                <w:r>
-                                  <w:rPr>
-                                    <w:rFonts w:ascii="Arial" w:cs="Arial" w:eastAsia="Arial" w:hAnsi="Arial"/>
-                                    <w:b w:val="0"/>
-                                    <w:i w:val="0"/>
-                                    <w:smallCaps w:val="0"/>
-                                    <w:strike w:val="0"/>
-                                    <w:color w:val="231f20"/>
-                                    <w:sz w:val="28"/>
-                                    <w:vertAlign w:val="baseline"/>
-                                  </w:rPr>
-                                  <w:t xml:space="preserve">Evaluation of Trends and Threat, and synthesis</w:t>
-                                </w:r>
-                              </w:p>
-                              <w:p>
-                                <w:pPr>
-                                  <w:spacing w:after="0" w:before="0" w:line="240"/>
-                                  <w:ind w:left="720" w:right="0" w:firstLine="360"/>
-                                  <w:jc w:val="left"/>
-                                  <w:textDirection w:val="btLr"/>
-                                </w:pPr>
-                                <w:r>
-                                  <w:rPr>
-                                    <w:rFonts w:ascii="Arial" w:cs="Arial" w:eastAsia="Arial" w:hAnsi="Arial"/>
-                                    <w:b w:val="0"/>
-                                    <w:i w:val="0"/>
-                                    <w:smallCaps w:val="0"/>
-                                    <w:strike w:val="0"/>
-                                    <w:color w:val="231f20"/>
-                                    <w:sz w:val="28"/>
-                                    <w:vertAlign w:val="baseline"/>
-                                  </w:rPr>
-                                </w:r>
-                                <w:r>
-                                  <w:rPr>
-                                    <w:rFonts w:ascii="Arial" w:cs="Arial" w:eastAsia="Arial" w:hAnsi="Arial"/>
-                                    <w:b w:val="0"/>
-                                    <w:i w:val="0"/>
-                                    <w:smallCaps w:val="0"/>
-                                    <w:strike w:val="0"/>
-                                    <w:color w:val="231f20"/>
-                                    <w:sz w:val="28"/>
-                                    <w:vertAlign w:val="baseline"/>
-                                  </w:rPr>
-                                  <w:t xml:space="preserve">Risks management organisation</w:t>
-                                </w:r>
-                              </w:p>
-                              <w:p>
-                                <w:pPr>
-                                  <w:spacing w:after="0" w:before="0" w:line="240"/>
-                                  <w:ind w:left="720" w:right="0" w:firstLine="360"/>
-                                  <w:jc w:val="left"/>
-                                  <w:textDirection w:val="btLr"/>
-                                </w:pPr>
-                                <w:r>
-                                  <w:rPr>
-                                    <w:rFonts w:ascii="Arial" w:cs="Arial" w:eastAsia="Arial" w:hAnsi="Arial"/>
-                                    <w:b w:val="0"/>
-                                    <w:i w:val="0"/>
-                                    <w:smallCaps w:val="0"/>
-                                    <w:strike w:val="0"/>
-                                    <w:color w:val="231f20"/>
-                                    <w:sz w:val="28"/>
-                                    <w:vertAlign w:val="baseline"/>
-                                  </w:rPr>
-                                </w:r>
-                                <w:r>
-                                  <w:rPr>
-                                    <w:rFonts w:ascii="Arial" w:cs="Arial" w:eastAsia="Arial" w:hAnsi="Arial"/>
-                                    <w:b w:val="0"/>
-                                    <w:i w:val="0"/>
-                                    <w:smallCaps w:val="0"/>
-                                    <w:strike w:val="0"/>
-                                    <w:color w:val="231f20"/>
-                                    <w:sz w:val="28"/>
-                                    <w:vertAlign w:val="baseline"/>
-                                  </w:rPr>
-                                  <w:t xml:space="preserve">Definition of the risk evaluation criteria</w:t>
-                                </w:r>
-                              </w:p>
-                              <w:p>
-                                <w:pPr>
-                                  <w:spacing w:after="0" w:before="0" w:line="240"/>
-                                  <w:ind w:left="0" w:right="0" w:firstLine="0"/>
-                                  <w:jc w:val="left"/>
-                                  <w:textDirection w:val="btLr"/>
-                                </w:pPr>
-                                <w:r>
-                                  <w:rPr>
-                                    <w:rFonts w:ascii="Arial" w:cs="Arial" w:eastAsia="Arial" w:hAnsi="Arial"/>
-                                    <w:b w:val="0"/>
-                                    <w:i w:val="0"/>
-                                    <w:smallCaps w:val="0"/>
-                                    <w:strike w:val="0"/>
-                                    <w:color w:val="231f20"/>
-                                    <w:sz w:val="28"/>
-                                    <w:vertAlign w:val="baseline"/>
-                                  </w:rPr>
-                                </w:r>
-                              </w:p>
-                            </w:txbxContent>
-                          </wps:txbx>
-                          <wps:bodyPr anchorCtr="0" anchor="t" bIns="91425" lIns="91425" spcFirstLastPara="1" rIns="91425" wrap="square" tIns="91425">
-                            <a:noAutofit/>
-                          </wps:bodyPr>
-                        </wps:wsp>
-                        <wps:wsp>
-                          <wps:cNvSpPr txBox="1"/>
-                          <wps:cNvPr id="7" name="Shape 7"/>
-                          <wps:spPr>
-                            <a:xfrm>
-                              <a:off x="994047" y="883600"/>
-                              <a:ext cx="1686900" cy="615600"/>
-                            </a:xfrm>
-                            <a:prstGeom prst="rect">
-                              <a:avLst/>
-                            </a:prstGeom>
-                            <a:noFill/>
-                            <a:ln>
-                              <a:noFill/>
-                            </a:ln>
-                          </wps:spPr>
-                          <wps:txbx>
-                            <w:txbxContent>
-                              <w:p>
-                                <w:pPr>
-                                  <w:spacing w:after="0" w:before="0" w:line="240"/>
-                                  <w:ind w:left="0" w:right="0" w:firstLine="0"/>
-                                  <w:jc w:val="center"/>
-                                  <w:textDirection w:val="btLr"/>
-                                </w:pPr>
-                                <w:r>
-                                  <w:rPr>
-                                    <w:rFonts w:ascii="Arial" w:cs="Arial" w:eastAsia="Arial" w:hAnsi="Arial"/>
-                                    <w:b w:val="1"/>
-                                    <w:i w:val="0"/>
-                                    <w:smallCaps w:val="0"/>
-                                    <w:strike w:val="0"/>
-                                    <w:color w:val="ffffff"/>
-                                    <w:sz w:val="28"/>
-                                    <w:vertAlign w:val="baseline"/>
-                                  </w:rPr>
-                                  <w:t xml:space="preserve">Context establishment</w:t>
-                                </w:r>
-                              </w:p>
-                            </w:txbxContent>
-                          </wps:txbx>
-                          <wps:bodyPr anchorCtr="0" anchor="t" bIns="91425" lIns="91425" spcFirstLastPara="1" rIns="91425" wrap="square" tIns="91425">
-                            <a:spAutoFit/>
-                          </wps:bodyPr>
-                        </wps:wsp>
-                        <wpg:grpSp>
-                          <wpg:cNvGrpSpPr/>
-                          <wpg:grpSpPr>
-                            <a:xfrm>
-                              <a:off x="3434009" y="1763600"/>
-                              <a:ext cx="4650738" cy="338700"/>
-                              <a:chOff x="3514337" y="1763600"/>
-                              <a:chExt cx="4650738" cy="338700"/>
-                            </a:xfrm>
-                          </wpg:grpSpPr>
-                          <wps:wsp>
-                            <wps:cNvCnPr/>
-                            <wps:spPr>
-                              <a:xfrm flipH="1" rot="10800000">
-                                <a:off x="3514337" y="1938050"/>
-                                <a:ext cx="1305300" cy="9900"/>
-                              </a:xfrm>
-                              <a:prstGeom prst="straightConnector1">
-                                <a:avLst/>
-                              </a:prstGeom>
-                              <a:noFill/>
-                              <a:ln cap="flat" cmpd="sng" w="9525">
-                                <a:solidFill>
-                                  <a:srgbClr val="2FA36B"/>
-                                </a:solidFill>
-                                <a:prstDash val="dot"/>
-                                <a:round/>
-                                <a:headEnd len="med" w="med" type="none"/>
-                                <a:tailEnd len="med" w="med" type="none"/>
-                              </a:ln>
-                            </wps:spPr>
-                            <wps:bodyPr anchorCtr="0" anchor="ctr" bIns="91425" lIns="91425" spcFirstLastPara="1" rIns="91425" wrap="square" tIns="91425">
-                              <a:noAutofit/>
-                            </wps:bodyPr>
-                          </wps:wsp>
-                          <wps:wsp>
-                            <wps:cNvSpPr txBox="1"/>
-                            <wps:cNvPr id="10" name="Shape 10"/>
-                            <wps:spPr>
-                              <a:xfrm>
-                                <a:off x="4839775" y="1763600"/>
-                                <a:ext cx="2098500" cy="338700"/>
-                              </a:xfrm>
-                              <a:prstGeom prst="rect">
-                                <a:avLst/>
-                              </a:prstGeom>
-                              <a:noFill/>
-                              <a:ln>
-                                <a:noFill/>
-                              </a:ln>
-                            </wps:spPr>
-                            <wps:txbx>
-                              <w:txbxContent>
-                                <w:p>
-                                  <w:pPr>
-                                    <w:spacing w:after="0" w:before="0" w:line="240"/>
-                                    <w:ind w:left="0" w:right="0" w:firstLine="0"/>
-                                    <w:jc w:val="left"/>
-                                    <w:textDirection w:val="btLr"/>
-                                  </w:pPr>
-                                  <w:r>
-                                    <w:rPr>
-                                      <w:rFonts w:ascii="Arial" w:cs="Arial" w:eastAsia="Arial" w:hAnsi="Arial"/>
-                                      <w:b w:val="1"/>
-                                      <w:i w:val="0"/>
-                                      <w:smallCaps w:val="0"/>
-                                      <w:strike w:val="0"/>
-                                      <w:color w:val="000000"/>
-                                      <w:sz w:val="20"/>
-                                      <w:vertAlign w:val="baseline"/>
-                                    </w:rPr>
-                                    <w:t xml:space="preserve">Deliverable: Context Validation</w:t>
-                                  </w:r>
-                                </w:p>
-                              </w:txbxContent>
-                            </wps:txbx>
-                            <wps:bodyPr anchorCtr="0" anchor="t" bIns="91425" lIns="91425" spcFirstLastPara="1" rIns="91425" wrap="square" tIns="91425">
-                              <a:spAutoFit/>
-                            </wps:bodyPr>
-                          </wps:wsp>
-                          <wps:wsp>
-                            <wps:cNvCnPr/>
-                            <wps:spPr>
-                              <a:xfrm flipH="1" rot="10800000">
-                                <a:off x="6859775" y="1928000"/>
-                                <a:ext cx="1305300" cy="9900"/>
-                              </a:xfrm>
-                              <a:prstGeom prst="straightConnector1">
-                                <a:avLst/>
-                              </a:prstGeom>
-                              <a:noFill/>
-                              <a:ln cap="flat" cmpd="sng" w="9525">
-                                <a:solidFill>
-                                  <a:srgbClr val="2FA36B"/>
-                                </a:solidFill>
-                                <a:prstDash val="dot"/>
-                                <a:round/>
-                                <a:headEnd len="med" w="med" type="none"/>
-                                <a:tailEnd len="med" w="med" type="none"/>
-                              </a:ln>
-                            </wps:spPr>
-                            <wps:bodyPr anchorCtr="0" anchor="ctr" bIns="91425" lIns="91425" spcFirstLastPara="1" rIns="91425" wrap="square" tIns="91425">
-                              <a:noAutofit/>
-                            </wps:bodyPr>
-                          </wps:wsp>
-                        </wpg:grpSp>
-                      </wpg:grpSp>
-                      <wpg:grpSp>
-                        <wpg:cNvGrpSpPr/>
-                        <wpg:grpSpPr>
-                          <a:xfrm>
-                            <a:off x="607375" y="1865150"/>
-                            <a:ext cx="7821825" cy="1580175"/>
-                            <a:chOff x="883600" y="522125"/>
-                            <a:chExt cx="7821825" cy="1580175"/>
-                          </a:xfrm>
-                        </wpg:grpSpPr>
-                        <wps:wsp>
-                          <wps:cNvSpPr/>
-                          <wps:cNvPr id="13" name="Shape 13"/>
-                          <wps:spPr>
-                            <a:xfrm>
-                              <a:off x="883600" y="522125"/>
-                              <a:ext cx="1921125" cy="1525750"/>
-                            </a:xfrm>
-                            <a:prstGeom prst="flowChartOffpageConnector">
-                              <a:avLst/>
-                            </a:prstGeom>
-                            <a:solidFill>
-                              <a:srgbClr val="2C8CA3"/>
-                            </a:solidFill>
-                            <a:ln>
-                              <a:noFill/>
-                            </a:ln>
-                          </wps:spPr>
-                          <wps:txbx>
-                            <w:txbxContent>
-                              <w:p>
-                                <w:pPr>
-                                  <w:spacing w:after="0" w:before="0" w:line="240"/>
-                                  <w:ind w:left="0" w:right="0" w:firstLine="0"/>
-                                  <w:jc w:val="center"/>
-                                  <w:textDirection w:val="btLr"/>
-                                </w:pPr>
-                              </w:p>
-                            </w:txbxContent>
-                          </wps:txbx>
-                          <wps:bodyPr anchorCtr="0" anchor="ctr" bIns="91425" lIns="91425" spcFirstLastPara="1" rIns="91425" wrap="square" tIns="91425">
-                            <a:noAutofit/>
-                          </wps:bodyPr>
-                        </wps:wsp>
-                        <wps:wsp>
-                          <wps:cNvSpPr/>
-                          <wps:cNvPr id="14" name="Shape 14"/>
-                          <wps:spPr>
-                            <a:xfrm>
-                              <a:off x="2804725" y="532175"/>
-                              <a:ext cx="5900700" cy="1215000"/>
-                            </a:xfrm>
-                            <a:prstGeom prst="roundRect">
-                              <a:avLst>
-                                <a:gd fmla="val 0" name="adj"/>
-                              </a:avLst>
-                            </a:prstGeom>
-                            <a:noFill/>
-                            <a:ln cap="flat" cmpd="sng" w="9525">
-                              <a:solidFill>
-                                <a:srgbClr val="2C8CA3"/>
-                              </a:solidFill>
-                              <a:prstDash val="solid"/>
-                              <a:round/>
-                              <a:headEnd len="sm" w="sm" type="none"/>
-                              <a:tailEnd len="sm" w="sm" type="none"/>
-                            </a:ln>
-                          </wps:spPr>
-                          <wps:txbx>
-                            <w:txbxContent>
-                              <w:p>
-                                <w:pPr>
-                                  <w:spacing w:after="0" w:before="0" w:line="240"/>
-                                  <w:ind w:left="0" w:right="0" w:firstLine="0"/>
-                                  <w:jc w:val="center"/>
-                                  <w:textDirection w:val="btLr"/>
-                                </w:pPr>
-                              </w:p>
-                            </w:txbxContent>
-                          </wps:txbx>
-                          <wps:bodyPr anchorCtr="0" anchor="ctr" bIns="91425" lIns="91425" spcFirstLastPara="1" rIns="91425" wrap="square" tIns="91425">
-                            <a:noAutofit/>
-                          </wps:bodyPr>
-                        </wps:wsp>
-                        <wps:wsp>
-                          <wps:cNvSpPr txBox="1"/>
-                          <wps:cNvPr id="15" name="Shape 15"/>
-                          <wps:spPr>
-                            <a:xfrm>
-                              <a:off x="2911882" y="632582"/>
-                              <a:ext cx="5683200" cy="1024200"/>
-                            </a:xfrm>
-                            <a:prstGeom prst="rect">
-                              <a:avLst/>
-                            </a:prstGeom>
-                            <a:noFill/>
-                            <a:ln>
-                              <a:noFill/>
-                            </a:ln>
-                          </wps:spPr>
-                          <wps:txbx>
-                            <w:txbxContent>
-                              <w:p>
-                                <w:pPr>
-                                  <w:spacing w:after="0" w:before="0" w:line="240"/>
-                                  <w:ind w:left="720" w:right="0" w:firstLine="360"/>
-                                  <w:jc w:val="left"/>
-                                  <w:textDirection w:val="btLr"/>
-                                </w:pPr>
-                                <w:r>
-                                  <w:rPr>
-                                    <w:rFonts w:ascii="Arial" w:cs="Arial" w:eastAsia="Arial" w:hAnsi="Arial"/>
-                                    <w:b w:val="0"/>
-                                    <w:i w:val="0"/>
-                                    <w:smallCaps w:val="0"/>
-                                    <w:strike w:val="0"/>
-                                    <w:color w:val="231f20"/>
-                                    <w:sz w:val="28"/>
-                                    <w:vertAlign w:val="baseline"/>
-                                  </w:rPr>
-                                  <w:t xml:space="preserve">Identification of assets, vulnerabilities and impacts appreciation</w:t>
-                                </w:r>
-                              </w:p>
-                              <w:p>
-                                <w:pPr>
-                                  <w:spacing w:after="0" w:before="0" w:line="240"/>
-                                  <w:ind w:left="720" w:right="0" w:firstLine="360"/>
-                                  <w:jc w:val="left"/>
-                                  <w:textDirection w:val="btLr"/>
-                                </w:pPr>
-                                <w:r>
-                                  <w:rPr>
-                                    <w:rFonts w:ascii="Arial" w:cs="Arial" w:eastAsia="Arial" w:hAnsi="Arial"/>
-                                    <w:b w:val="0"/>
-                                    <w:i w:val="0"/>
-                                    <w:smallCaps w:val="0"/>
-                                    <w:strike w:val="0"/>
-                                    <w:color w:val="231f20"/>
-                                    <w:sz w:val="28"/>
-                                    <w:vertAlign w:val="baseline"/>
-                                  </w:rPr>
-                                </w:r>
-                                <w:r>
-                                  <w:rPr>
-                                    <w:rFonts w:ascii="Arial" w:cs="Arial" w:eastAsia="Arial" w:hAnsi="Arial"/>
-                                    <w:b w:val="0"/>
-                                    <w:i w:val="0"/>
-                                    <w:smallCaps w:val="0"/>
-                                    <w:strike w:val="0"/>
-                                    <w:color w:val="231f20"/>
-                                    <w:sz w:val="28"/>
-                                    <w:vertAlign w:val="baseline"/>
-                                  </w:rPr>
-                                  <w:t xml:space="preserve">Synthesis of assets / impacts</w:t>
-                                </w:r>
-                              </w:p>
-                              <w:p>
-                                <w:pPr>
-                                  <w:spacing w:after="0" w:before="0" w:line="240"/>
-                                  <w:ind w:left="0" w:right="0" w:firstLine="0"/>
-                                  <w:jc w:val="left"/>
-                                  <w:textDirection w:val="btLr"/>
-                                </w:pPr>
-                                <w:r>
-                                  <w:rPr>
-                                    <w:rFonts w:ascii="Arial" w:cs="Arial" w:eastAsia="Arial" w:hAnsi="Arial"/>
-                                    <w:b w:val="0"/>
-                                    <w:i w:val="0"/>
-                                    <w:smallCaps w:val="0"/>
-                                    <w:strike w:val="0"/>
-                                    <w:color w:val="231f20"/>
-                                    <w:sz w:val="28"/>
-                                    <w:vertAlign w:val="baseline"/>
-                                  </w:rPr>
-                                </w:r>
-                              </w:p>
-                            </w:txbxContent>
-                          </wps:txbx>
-                          <wps:bodyPr anchorCtr="0" anchor="t" bIns="91425" lIns="91425" spcFirstLastPara="1" rIns="91425" wrap="square" tIns="91425">
-                            <a:noAutofit/>
-                          </wps:bodyPr>
-                        </wps:wsp>
-                        <wps:wsp>
-                          <wps:cNvSpPr txBox="1"/>
-                          <wps:cNvPr id="16" name="Shape 16"/>
-                          <wps:spPr>
-                            <a:xfrm>
-                              <a:off x="994047" y="883600"/>
-                              <a:ext cx="1686900" cy="615600"/>
-                            </a:xfrm>
-                            <a:prstGeom prst="rect">
-                              <a:avLst/>
-                            </a:prstGeom>
-                            <a:noFill/>
-                            <a:ln>
-                              <a:noFill/>
-                            </a:ln>
-                          </wps:spPr>
-                          <wps:txbx>
-                            <w:txbxContent>
-                              <w:p>
-                                <w:pPr>
-                                  <w:spacing w:after="0" w:before="0" w:line="240"/>
-                                  <w:ind w:left="0" w:right="0" w:firstLine="0"/>
-                                  <w:jc w:val="center"/>
-                                  <w:textDirection w:val="btLr"/>
-                                </w:pPr>
-                                <w:r>
-                                  <w:rPr>
-                                    <w:rFonts w:ascii="Arial" w:cs="Arial" w:eastAsia="Arial" w:hAnsi="Arial"/>
-                                    <w:b w:val="1"/>
-                                    <w:i w:val="0"/>
-                                    <w:smallCaps w:val="0"/>
-                                    <w:strike w:val="0"/>
-                                    <w:color w:val="ffffff"/>
-                                    <w:sz w:val="28"/>
-                                    <w:vertAlign w:val="baseline"/>
-                                  </w:rPr>
-                                  <w:t xml:space="preserve">Context modelling</w:t>
-                                </w:r>
-                              </w:p>
-                            </w:txbxContent>
-                          </wps:txbx>
-                          <wps:bodyPr anchorCtr="0" anchor="t" bIns="91425" lIns="91425" spcFirstLastPara="1" rIns="91425" wrap="square" tIns="91425">
-                            <a:spAutoFit/>
-                          </wps:bodyPr>
-                        </wps:wsp>
-                        <wpg:grpSp>
-                          <wpg:cNvGrpSpPr/>
-                          <wpg:grpSpPr>
-                            <a:xfrm>
-                              <a:off x="3434009" y="1763600"/>
-                              <a:ext cx="4650738" cy="338700"/>
-                              <a:chOff x="3514337" y="1763600"/>
-                              <a:chExt cx="4650738" cy="338700"/>
-                            </a:xfrm>
-                          </wpg:grpSpPr>
-                          <wps:wsp>
-                            <wps:cNvCnPr/>
-                            <wps:spPr>
-                              <a:xfrm flipH="1" rot="10800000">
-                                <a:off x="3514337" y="1938050"/>
-                                <a:ext cx="1305300" cy="9900"/>
-                              </a:xfrm>
-                              <a:prstGeom prst="straightConnector1">
-                                <a:avLst/>
-                              </a:prstGeom>
-                              <a:noFill/>
-                              <a:ln cap="flat" cmpd="sng" w="9525">
-                                <a:solidFill>
-                                  <a:srgbClr val="2C8CA3"/>
-                                </a:solidFill>
-                                <a:prstDash val="dot"/>
-                                <a:round/>
-                                <a:headEnd len="med" w="med" type="none"/>
-                                <a:tailEnd len="med" w="med" type="none"/>
-                              </a:ln>
-                            </wps:spPr>
-                            <wps:bodyPr anchorCtr="0" anchor="ctr" bIns="91425" lIns="91425" spcFirstLastPara="1" rIns="91425" wrap="square" tIns="91425">
-                              <a:noAutofit/>
-                            </wps:bodyPr>
-                          </wps:wsp>
-                          <wps:wsp>
-                            <wps:cNvSpPr txBox="1"/>
-                            <wps:cNvPr id="19" name="Shape 19"/>
-                            <wps:spPr>
-                              <a:xfrm>
-                                <a:off x="4839775" y="1763600"/>
-                                <a:ext cx="2098500" cy="338700"/>
-                              </a:xfrm>
-                              <a:prstGeom prst="rect">
-                                <a:avLst/>
-                              </a:prstGeom>
-                              <a:noFill/>
-                              <a:ln>
-                                <a:noFill/>
-                              </a:ln>
-                            </wps:spPr>
-                            <wps:txbx>
-                              <w:txbxContent>
-                                <w:p>
-                                  <w:pPr>
-                                    <w:spacing w:after="240" w:before="240" w:line="275.9999942779541"/>
-                                    <w:ind w:left="0" w:right="0" w:firstLine="0"/>
-                                    <w:jc w:val="left"/>
-                                    <w:textDirection w:val="btLr"/>
-                                  </w:pPr>
-                                  <w:r>
-                                    <w:rPr>
-                                      <w:rFonts w:ascii="Arial" w:cs="Arial" w:eastAsia="Arial" w:hAnsi="Arial"/>
-                                      <w:b w:val="1"/>
-                                      <w:i w:val="0"/>
-                                      <w:smallCaps w:val="0"/>
-                                      <w:strike w:val="0"/>
-                                      <w:color w:val="000000"/>
-                                      <w:sz w:val="20"/>
-                                      <w:vertAlign w:val="baseline"/>
-                                    </w:rPr>
-                                    <w:t xml:space="preserve">Deliverable: Model Validation</w:t>
-                                  </w:r>
-                                </w:p>
-                              </w:txbxContent>
-                            </wps:txbx>
-                            <wps:bodyPr anchorCtr="0" anchor="t" bIns="91425" lIns="91425" spcFirstLastPara="1" rIns="91425" wrap="square" tIns="91425">
-                              <a:spAutoFit/>
-                            </wps:bodyPr>
-                          </wps:wsp>
-                          <wps:wsp>
-                            <wps:cNvCnPr/>
-                            <wps:spPr>
-                              <a:xfrm flipH="1" rot="10800000">
-                                <a:off x="6859775" y="1928000"/>
-                                <a:ext cx="1305300" cy="9900"/>
-                              </a:xfrm>
-                              <a:prstGeom prst="straightConnector1">
-                                <a:avLst/>
-                              </a:prstGeom>
-                              <a:noFill/>
-                              <a:ln cap="flat" cmpd="sng" w="9525">
-                                <a:solidFill>
-                                  <a:srgbClr val="2C8CA3"/>
-                                </a:solidFill>
-                                <a:prstDash val="dot"/>
-                                <a:round/>
-                                <a:headEnd len="med" w="med" type="none"/>
-                                <a:tailEnd len="med" w="med" type="none"/>
-                              </a:ln>
-                            </wps:spPr>
-                            <wps:bodyPr anchorCtr="0" anchor="ctr" bIns="91425" lIns="91425" spcFirstLastPara="1" rIns="91425" wrap="square" tIns="91425">
-                              <a:noAutofit/>
-                            </wps:bodyPr>
-                          </wps:wsp>
-                        </wpg:grpSp>
-                      </wpg:grpSp>
-                      <wpg:grpSp>
-                        <wpg:cNvGrpSpPr/>
-                        <wpg:grpSpPr>
-                          <a:xfrm>
-                            <a:off x="607375" y="3474875"/>
-                            <a:ext cx="7821825" cy="1580175"/>
-                            <a:chOff x="883600" y="522125"/>
-                            <a:chExt cx="7821825" cy="1580175"/>
-                          </a:xfrm>
-                        </wpg:grpSpPr>
-                        <wps:wsp>
-                          <wps:cNvSpPr/>
-                          <wps:cNvPr id="22" name="Shape 22"/>
-                          <wps:spPr>
-                            <a:xfrm>
-                              <a:off x="883600" y="522125"/>
-                              <a:ext cx="1921125" cy="1525750"/>
-                            </a:xfrm>
-                            <a:prstGeom prst="flowChartOffpageConnector">
-                              <a:avLst/>
-                            </a:prstGeom>
-                            <a:solidFill>
-                              <a:srgbClr val="F1B800"/>
-                            </a:solidFill>
-                            <a:ln>
-                              <a:noFill/>
-                            </a:ln>
-                          </wps:spPr>
-                          <wps:txbx>
-                            <w:txbxContent>
-                              <w:p>
-                                <w:pPr>
-                                  <w:spacing w:after="0" w:before="0" w:line="240"/>
-                                  <w:ind w:left="0" w:right="0" w:firstLine="0"/>
-                                  <w:jc w:val="center"/>
-                                  <w:textDirection w:val="btLr"/>
-                                </w:pPr>
-                              </w:p>
-                            </w:txbxContent>
-                          </wps:txbx>
-                          <wps:bodyPr anchorCtr="0" anchor="ctr" bIns="91425" lIns="91425" spcFirstLastPara="1" rIns="91425" wrap="square" tIns="91425">
-                            <a:noAutofit/>
-                          </wps:bodyPr>
-                        </wps:wsp>
-                        <wps:wsp>
-                          <wps:cNvSpPr/>
-                          <wps:cNvPr id="23" name="Shape 23"/>
-                          <wps:spPr>
-                            <a:xfrm>
-                              <a:off x="2804725" y="532175"/>
-                              <a:ext cx="5900700" cy="1215000"/>
-                            </a:xfrm>
-                            <a:prstGeom prst="roundRect">
-                              <a:avLst>
-                                <a:gd fmla="val 0" name="adj"/>
-                              </a:avLst>
-                            </a:prstGeom>
-                            <a:noFill/>
-                            <a:ln cap="flat" cmpd="sng" w="9525">
-                              <a:solidFill>
-                                <a:srgbClr val="F1B800"/>
-                              </a:solidFill>
-                              <a:prstDash val="solid"/>
-                              <a:round/>
-                              <a:headEnd len="sm" w="sm" type="none"/>
-                              <a:tailEnd len="sm" w="sm" type="none"/>
-                            </a:ln>
-                          </wps:spPr>
-                          <wps:txbx>
-                            <w:txbxContent>
-                              <w:p>
-                                <w:pPr>
-                                  <w:spacing w:after="0" w:before="0" w:line="240"/>
-                                  <w:ind w:left="0" w:right="0" w:firstLine="0"/>
-                                  <w:jc w:val="center"/>
-                                  <w:textDirection w:val="btLr"/>
-                                </w:pPr>
-                              </w:p>
-                            </w:txbxContent>
-                          </wps:txbx>
-                          <wps:bodyPr anchorCtr="0" anchor="ctr" bIns="91425" lIns="91425" spcFirstLastPara="1" rIns="91425" wrap="square" tIns="91425">
-                            <a:noAutofit/>
-                          </wps:bodyPr>
-                        </wps:wsp>
-                        <wps:wsp>
-                          <wps:cNvSpPr txBox="1"/>
-                          <wps:cNvPr id="24" name="Shape 24"/>
-                          <wps:spPr>
-                            <a:xfrm>
-                              <a:off x="2911882" y="632582"/>
-                              <a:ext cx="5683200" cy="1024200"/>
-                            </a:xfrm>
-                            <a:prstGeom prst="rect">
-                              <a:avLst/>
-                            </a:prstGeom>
-                            <a:noFill/>
-                            <a:ln>
-                              <a:noFill/>
-                            </a:ln>
-                          </wps:spPr>
-                          <wps:txbx>
-                            <w:txbxContent>
-                              <w:p>
-                                <w:pPr>
-                                  <w:spacing w:after="0" w:before="0" w:line="240"/>
-                                  <w:ind w:left="720" w:right="0" w:firstLine="360"/>
-                                  <w:jc w:val="left"/>
-                                  <w:textDirection w:val="btLr"/>
-                                </w:pPr>
-                                <w:r>
-                                  <w:rPr>
-                                    <w:rFonts w:ascii="Arial" w:cs="Arial" w:eastAsia="Arial" w:hAnsi="Arial"/>
-                                    <w:b w:val="0"/>
-                                    <w:i w:val="0"/>
-                                    <w:smallCaps w:val="0"/>
-                                    <w:strike w:val="0"/>
-                                    <w:color w:val="231f20"/>
-                                    <w:sz w:val="28"/>
-                                    <w:vertAlign w:val="baseline"/>
-                                  </w:rPr>
-                                  <w:t xml:space="preserve">Estimation, evaluation and risk treatment</w:t>
-                                </w:r>
-                              </w:p>
-                              <w:p>
-                                <w:pPr>
-                                  <w:spacing w:after="0" w:before="0" w:line="240"/>
-                                  <w:ind w:left="720" w:right="0" w:firstLine="360"/>
-                                  <w:jc w:val="left"/>
-                                  <w:textDirection w:val="btLr"/>
-                                </w:pPr>
-                                <w:r>
-                                  <w:rPr>
-                                    <w:rFonts w:ascii="Arial" w:cs="Arial" w:eastAsia="Arial" w:hAnsi="Arial"/>
-                                    <w:b w:val="0"/>
-                                    <w:i w:val="0"/>
-                                    <w:smallCaps w:val="0"/>
-                                    <w:strike w:val="0"/>
-                                    <w:color w:val="231f20"/>
-                                    <w:sz w:val="28"/>
-                                    <w:vertAlign w:val="baseline"/>
-                                  </w:rPr>
-                                </w:r>
-                                <w:r>
-                                  <w:rPr>
-                                    <w:rFonts w:ascii="Arial" w:cs="Arial" w:eastAsia="Arial" w:hAnsi="Arial"/>
-                                    <w:b w:val="0"/>
-                                    <w:i w:val="0"/>
-                                    <w:smallCaps w:val="0"/>
-                                    <w:strike w:val="0"/>
-                                    <w:color w:val="231f20"/>
-                                    <w:sz w:val="28"/>
-                                    <w:vertAlign w:val="baseline"/>
-                                  </w:rPr>
-                                  <w:t xml:space="preserve">Risk treatment plan management</w:t>
-                                </w:r>
-                              </w:p>
-                              <w:p>
-                                <w:pPr>
-                                  <w:spacing w:after="0" w:before="0" w:line="240"/>
-                                  <w:ind w:left="0" w:right="0" w:firstLine="0"/>
-                                  <w:jc w:val="left"/>
-                                  <w:textDirection w:val="btLr"/>
-                                </w:pPr>
-                                <w:r>
-                                  <w:rPr>
-                                    <w:rFonts w:ascii="Arial" w:cs="Arial" w:eastAsia="Arial" w:hAnsi="Arial"/>
-                                    <w:b w:val="0"/>
-                                    <w:i w:val="0"/>
-                                    <w:smallCaps w:val="0"/>
-                                    <w:strike w:val="0"/>
-                                    <w:color w:val="231f20"/>
-                                    <w:sz w:val="28"/>
-                                    <w:vertAlign w:val="baseline"/>
-                                  </w:rPr>
-                                </w:r>
-                              </w:p>
-                            </w:txbxContent>
-                          </wps:txbx>
-                          <wps:bodyPr anchorCtr="0" anchor="t" bIns="91425" lIns="91425" spcFirstLastPara="1" rIns="91425" wrap="square" tIns="91425">
-                            <a:noAutofit/>
-                          </wps:bodyPr>
-                        </wps:wsp>
-                        <wps:wsp>
-                          <wps:cNvSpPr txBox="1"/>
-                          <wps:cNvPr id="25" name="Shape 25"/>
-                          <wps:spPr>
-                            <a:xfrm>
-                              <a:off x="994047" y="883600"/>
-                              <a:ext cx="1686900" cy="648000"/>
-                            </a:xfrm>
-                            <a:prstGeom prst="rect">
-                              <a:avLst/>
-                            </a:prstGeom>
-                            <a:noFill/>
-                            <a:ln>
-                              <a:noFill/>
-                            </a:ln>
-                          </wps:spPr>
-                          <wps:txbx>
-                            <w:txbxContent>
-                              <w:p>
-                                <w:pPr>
-                                  <w:spacing w:after="80" w:before="360" w:line="275.9999942779541"/>
-                                  <w:ind w:left="0" w:right="0" w:firstLine="0"/>
-                                  <w:jc w:val="center"/>
-                                  <w:textDirection w:val="btLr"/>
-                                </w:pPr>
-                                <w:r>
-                                  <w:rPr>
-                                    <w:rFonts w:ascii="Arial" w:cs="Arial" w:eastAsia="Arial" w:hAnsi="Arial"/>
-                                    <w:b w:val="1"/>
-                                    <w:i w:val="0"/>
-                                    <w:smallCaps w:val="0"/>
-                                    <w:strike w:val="0"/>
-                                    <w:color w:val="ffffff"/>
-                                    <w:sz w:val="28"/>
-                                    <w:vertAlign w:val="baseline"/>
-                                  </w:rPr>
-                                  <w:t xml:space="preserve">Evaluation and treatment of risks</w:t>
-                                </w:r>
-                              </w:p>
-                            </w:txbxContent>
-                          </wps:txbx>
-                          <wps:bodyPr anchorCtr="0" anchor="t" bIns="91425" lIns="91425" spcFirstLastPara="1" rIns="91425" wrap="square" tIns="91425">
-                            <a:spAutoFit/>
-                          </wps:bodyPr>
-                        </wps:wsp>
-                        <wpg:grpSp>
-                          <wpg:cNvGrpSpPr/>
-                          <wpg:grpSpPr>
-                            <a:xfrm>
-                              <a:off x="3472125" y="1763600"/>
-                              <a:ext cx="4544100" cy="338700"/>
-                              <a:chOff x="3552453" y="1763600"/>
-                              <a:chExt cx="4544100" cy="338700"/>
-                            </a:xfrm>
-                          </wpg:grpSpPr>
-                          <wps:wsp>
-                            <wps:cNvCnPr/>
-                            <wps:spPr>
-                              <a:xfrm flipH="1" rot="10800000">
-                                <a:off x="3552453" y="1932950"/>
-                                <a:ext cx="894900" cy="15000"/>
-                              </a:xfrm>
-                              <a:prstGeom prst="straightConnector1">
-                                <a:avLst/>
-                              </a:prstGeom>
-                              <a:noFill/>
-                              <a:ln cap="flat" cmpd="sng" w="9525">
-                                <a:solidFill>
-                                  <a:srgbClr val="F1B800"/>
-                                </a:solidFill>
-                                <a:prstDash val="dot"/>
-                                <a:round/>
-                                <a:headEnd len="med" w="med" type="none"/>
-                                <a:tailEnd len="med" w="med" type="none"/>
-                              </a:ln>
-                            </wps:spPr>
-                            <wps:bodyPr anchorCtr="0" anchor="ctr" bIns="91425" lIns="91425" spcFirstLastPara="1" rIns="91425" wrap="square" tIns="91425">
-                              <a:noAutofit/>
-                            </wps:bodyPr>
-                          </wps:wsp>
-                          <wps:wsp>
-                            <wps:cNvSpPr txBox="1"/>
-                            <wps:cNvPr id="28" name="Shape 28"/>
-                            <wps:spPr>
-                              <a:xfrm>
-                                <a:off x="4447353" y="1763600"/>
-                                <a:ext cx="2668200" cy="338700"/>
-                              </a:xfrm>
-                              <a:prstGeom prst="rect">
-                                <a:avLst/>
-                              </a:prstGeom>
-                              <a:noFill/>
-                              <a:ln>
-                                <a:noFill/>
-                              </a:ln>
-                            </wps:spPr>
-                            <wps:txbx>
-                              <w:txbxContent>
-                                <w:p>
-                                  <w:pPr>
-                                    <w:spacing w:after="240" w:before="240" w:line="275.9999942779541"/>
-                                    <w:ind w:left="0" w:right="0" w:firstLine="0"/>
-                                    <w:jc w:val="left"/>
-                                    <w:textDirection w:val="btLr"/>
-                                  </w:pPr>
-                                  <w:r>
-                                    <w:rPr>
-                                      <w:rFonts w:ascii="Arial" w:cs="Arial" w:eastAsia="Arial" w:hAnsi="Arial"/>
-                                      <w:b w:val="1"/>
-                                      <w:i w:val="0"/>
-                                      <w:smallCaps w:val="0"/>
-                                      <w:strike w:val="0"/>
-                                      <w:color w:val="000000"/>
-                                      <w:sz w:val="20"/>
-                                      <w:vertAlign w:val="baseline"/>
-                                    </w:rPr>
-                                    <w:t xml:space="preserve">Deliverable: Final Report / Decision point</w:t>
-                                  </w:r>
-                                </w:p>
-                              </w:txbxContent>
-                            </wps:txbx>
-                            <wps:bodyPr anchorCtr="0" anchor="t" bIns="91425" lIns="91425" spcFirstLastPara="1" rIns="91425" wrap="square" tIns="91425">
-                              <a:spAutoFit/>
-                            </wps:bodyPr>
-                          </wps:wsp>
-                          <wps:wsp>
-                            <wps:cNvCnPr/>
-                            <wps:spPr>
-                              <a:xfrm flipH="1" rot="10800000">
-                                <a:off x="7115553" y="1928150"/>
-                                <a:ext cx="981000" cy="4800"/>
-                              </a:xfrm>
-                              <a:prstGeom prst="straightConnector1">
-                                <a:avLst/>
-                              </a:prstGeom>
-                              <a:noFill/>
-                              <a:ln cap="flat" cmpd="sng" w="9525">
-                                <a:solidFill>
-                                  <a:srgbClr val="F1B800"/>
-                                </a:solidFill>
-                                <a:prstDash val="dot"/>
-                                <a:round/>
-                                <a:headEnd len="med" w="med" type="none"/>
-                                <a:tailEnd len="med" w="med" type="none"/>
-                              </a:ln>
-                            </wps:spPr>
-                            <wps:bodyPr anchorCtr="0" anchor="ctr" bIns="91425" lIns="91425" spcFirstLastPara="1" rIns="91425" wrap="square" tIns="91425">
-                              <a:noAutofit/>
-                            </wps:bodyPr>
-                          </wps:wsp>
-                        </wpg:grpSp>
-                      </wpg:grpSp>
-                      <wpg:grpSp>
-                        <wpg:cNvGrpSpPr/>
-                        <wpg:grpSpPr>
-                          <a:xfrm>
-                            <a:off x="607375" y="5094125"/>
-                            <a:ext cx="7821825" cy="1612875"/>
-                            <a:chOff x="883600" y="522125"/>
-                            <a:chExt cx="7821825" cy="1612875"/>
-                          </a:xfrm>
-                        </wpg:grpSpPr>
-                        <wps:wsp>
-                          <wps:cNvSpPr/>
-                          <wps:cNvPr id="31" name="Shape 31"/>
-                          <wps:spPr>
-                            <a:xfrm>
-                              <a:off x="883600" y="522125"/>
-                              <a:ext cx="1921125" cy="1525750"/>
-                            </a:xfrm>
-                            <a:prstGeom prst="flowChartOffpageConnector">
-                              <a:avLst/>
-                            </a:prstGeom>
-                            <a:solidFill>
-                              <a:srgbClr val="C0392B"/>
-                            </a:solidFill>
-                            <a:ln>
-                              <a:noFill/>
-                            </a:ln>
-                          </wps:spPr>
-                          <wps:txbx>
-                            <w:txbxContent>
-                              <w:p>
-                                <w:pPr>
-                                  <w:spacing w:after="0" w:before="0" w:line="240"/>
-                                  <w:ind w:left="0" w:right="0" w:firstLine="0"/>
-                                  <w:jc w:val="center"/>
-                                  <w:textDirection w:val="btLr"/>
-                                </w:pPr>
-                              </w:p>
-                            </w:txbxContent>
-                          </wps:txbx>
-                          <wps:bodyPr anchorCtr="0" anchor="ctr" bIns="91425" lIns="91425" spcFirstLastPara="1" rIns="91425" wrap="square" tIns="91425">
-                            <a:noAutofit/>
-                          </wps:bodyPr>
-                        </wps:wsp>
-                        <wps:wsp>
-                          <wps:cNvSpPr/>
-                          <wps:cNvPr id="32" name="Shape 32"/>
-                          <wps:spPr>
-                            <a:xfrm>
-                              <a:off x="2804725" y="532175"/>
-                              <a:ext cx="5900700" cy="1215000"/>
-                            </a:xfrm>
-                            <a:prstGeom prst="roundRect">
-                              <a:avLst>
-                                <a:gd fmla="val 0" name="adj"/>
-                              </a:avLst>
-                            </a:prstGeom>
-                            <a:noFill/>
-                            <a:ln cap="flat" cmpd="sng" w="9525">
-                              <a:solidFill>
-                                <a:srgbClr val="C0392B"/>
-                              </a:solidFill>
-                              <a:prstDash val="solid"/>
-                              <a:round/>
-                              <a:headEnd len="sm" w="sm" type="none"/>
-                              <a:tailEnd len="sm" w="sm" type="none"/>
-                            </a:ln>
-                          </wps:spPr>
-                          <wps:txbx>
-                            <w:txbxContent>
-                              <w:p>
-                                <w:pPr>
-                                  <w:spacing w:after="0" w:before="0" w:line="240"/>
-                                  <w:ind w:left="0" w:right="0" w:firstLine="0"/>
-                                  <w:jc w:val="center"/>
-                                  <w:textDirection w:val="btLr"/>
-                                </w:pPr>
-                              </w:p>
-                            </w:txbxContent>
-                          </wps:txbx>
-                          <wps:bodyPr anchorCtr="0" anchor="ctr" bIns="91425" lIns="91425" spcFirstLastPara="1" rIns="91425" wrap="square" tIns="91425">
-                            <a:noAutofit/>
-                          </wps:bodyPr>
-                        </wps:wsp>
-                        <wps:wsp>
-                          <wps:cNvSpPr txBox="1"/>
-                          <wps:cNvPr id="33" name="Shape 33"/>
-                          <wps:spPr>
-                            <a:xfrm>
-                              <a:off x="2911882" y="632582"/>
-                              <a:ext cx="5683200" cy="1024200"/>
-                            </a:xfrm>
-                            <a:prstGeom prst="rect">
-                              <a:avLst/>
-                            </a:prstGeom>
-                            <a:noFill/>
-                            <a:ln>
-                              <a:noFill/>
-                            </a:ln>
-                          </wps:spPr>
-                          <wps:txbx>
-                            <w:txbxContent>
-                              <w:p>
-                                <w:pPr>
-                                  <w:spacing w:after="0" w:before="0" w:line="240"/>
-                                  <w:ind w:left="720" w:right="0" w:firstLine="360"/>
-                                  <w:jc w:val="left"/>
-                                  <w:textDirection w:val="btLr"/>
-                                </w:pPr>
-                                <w:r>
-                                  <w:rPr>
-                                    <w:rFonts w:ascii="Arial" w:cs="Arial" w:eastAsia="Arial" w:hAnsi="Arial"/>
-                                    <w:b w:val="0"/>
-                                    <w:i w:val="0"/>
-                                    <w:smallCaps w:val="0"/>
-                                    <w:strike w:val="0"/>
-                                    <w:color w:val="231f20"/>
-                                    <w:sz w:val="28"/>
-                                    <w:vertAlign w:val="baseline"/>
-                                  </w:rPr>
-                                  <w:t xml:space="preserve">Management of the implementation of the risk treatment plan</w:t>
-                                </w:r>
-                              </w:p>
-                            </w:txbxContent>
-                          </wps:txbx>
-                          <wps:bodyPr anchorCtr="0" anchor="t" bIns="91425" lIns="91425" spcFirstLastPara="1" rIns="91425" wrap="square" tIns="91425">
-                            <a:noAutofit/>
-                          </wps:bodyPr>
-                        </wps:wsp>
-                        <wps:wsp>
-                          <wps:cNvSpPr txBox="1"/>
-                          <wps:cNvPr id="34" name="Shape 34"/>
-                          <wps:spPr>
-                            <a:xfrm>
-                              <a:off x="994047" y="883600"/>
-                              <a:ext cx="1686900" cy="648000"/>
-                            </a:xfrm>
-                            <a:prstGeom prst="rect">
-                              <a:avLst/>
-                            </a:prstGeom>
-                            <a:noFill/>
-                            <a:ln>
-                              <a:noFill/>
-                            </a:ln>
-                          </wps:spPr>
-                          <wps:txbx>
-                            <w:txbxContent>
-                              <w:p>
-                                <w:pPr>
-                                  <w:spacing w:after="80" w:before="360" w:line="275.9999942779541"/>
-                                  <w:ind w:left="0" w:right="0" w:firstLine="0"/>
-                                  <w:jc w:val="center"/>
-                                  <w:textDirection w:val="btLr"/>
-                                </w:pPr>
-                                <w:r>
-                                  <w:rPr>
-                                    <w:rFonts w:ascii="Arial" w:cs="Arial" w:eastAsia="Arial" w:hAnsi="Arial"/>
-                                    <w:b w:val="1"/>
-                                    <w:i w:val="0"/>
-                                    <w:smallCaps w:val="0"/>
-                                    <w:strike w:val="0"/>
-                                    <w:color w:val="ffffff"/>
-                                    <w:sz w:val="28"/>
-                                    <w:vertAlign w:val="baseline"/>
-                                  </w:rPr>
-                                  <w:t xml:space="preserve">Implementation and monitoring</w:t>
-                                </w:r>
-                              </w:p>
-                            </w:txbxContent>
-                          </wps:txbx>
-                          <wps:bodyPr anchorCtr="0" anchor="t" bIns="91425" lIns="91425" spcFirstLastPara="1" rIns="91425" wrap="square" tIns="91425">
-                            <a:spAutoFit/>
-                          </wps:bodyPr>
-                        </wps:wsp>
-                        <wpg:grpSp>
-                          <wpg:cNvGrpSpPr/>
-                          <wpg:grpSpPr>
-                            <a:xfrm>
-                              <a:off x="3464562" y="1796300"/>
-                              <a:ext cx="4523125" cy="338700"/>
-                              <a:chOff x="3544890" y="1796300"/>
-                              <a:chExt cx="4523125" cy="338700"/>
-                            </a:xfrm>
-                          </wpg:grpSpPr>
-                          <wps:wsp>
-                            <wps:cNvCnPr/>
-                            <wps:spPr>
-                              <a:xfrm>
-                                <a:off x="3544890" y="1963250"/>
-                                <a:ext cx="1068000" cy="2400"/>
-                              </a:xfrm>
-                              <a:prstGeom prst="straightConnector1">
-                                <a:avLst/>
-                              </a:prstGeom>
-                              <a:noFill/>
-                              <a:ln cap="flat" cmpd="sng" w="9525">
-                                <a:solidFill>
-                                  <a:srgbClr val="C0392B"/>
-                                </a:solidFill>
-                                <a:prstDash val="dot"/>
-                                <a:round/>
-                                <a:headEnd len="med" w="med" type="none"/>
-                                <a:tailEnd len="med" w="med" type="none"/>
-                              </a:ln>
-                            </wps:spPr>
-                            <wps:bodyPr anchorCtr="0" anchor="ctr" bIns="91425" lIns="91425" spcFirstLastPara="1" rIns="91425" wrap="square" tIns="91425">
-                              <a:noAutofit/>
-                            </wps:bodyPr>
-                          </wps:wsp>
-                          <wps:wsp>
-                            <wps:cNvSpPr txBox="1"/>
-                            <wps:cNvPr id="37" name="Shape 37"/>
-                            <wps:spPr>
-                              <a:xfrm>
-                                <a:off x="4612890" y="1796300"/>
-                                <a:ext cx="2191800" cy="338700"/>
-                              </a:xfrm>
-                              <a:prstGeom prst="rect">
-                                <a:avLst/>
-                              </a:prstGeom>
-                              <a:noFill/>
-                              <a:ln>
-                                <a:noFill/>
-                              </a:ln>
-                            </wps:spPr>
-                            <wps:txbx>
-                              <w:txbxContent>
-                                <w:p>
-                                  <w:pPr>
-                                    <w:spacing w:after="240" w:before="240" w:line="275.9999942779541"/>
-                                    <w:ind w:left="0" w:right="0" w:firstLine="0"/>
-                                    <w:jc w:val="left"/>
-                                    <w:textDirection w:val="btLr"/>
-                                  </w:pPr>
-                                  <w:r>
-                                    <w:rPr>
-                                      <w:rFonts w:ascii="Arial" w:cs="Arial" w:eastAsia="Arial" w:hAnsi="Arial"/>
-                                      <w:b w:val="1"/>
-                                      <w:i w:val="0"/>
-                                      <w:smallCaps w:val="0"/>
-                                      <w:strike w:val="0"/>
-                                      <w:color w:val="000000"/>
-                                      <w:sz w:val="20"/>
-                                      <w:vertAlign w:val="baseline"/>
-                                    </w:rPr>
-                                    <w:t xml:space="preserve">Deliverable: Implementation Plan</w:t>
-                                  </w:r>
-                                </w:p>
-                              </w:txbxContent>
-                            </wps:txbx>
-                            <wps:bodyPr anchorCtr="0" anchor="t" bIns="91425" lIns="91425" spcFirstLastPara="1" rIns="91425" wrap="square" tIns="91425">
-                              <a:spAutoFit/>
-                            </wps:bodyPr>
-                          </wps:wsp>
-                          <wps:wsp>
-                            <wps:cNvCnPr/>
-                            <wps:spPr>
-                              <a:xfrm flipH="1" rot="10800000">
-                                <a:off x="6820015" y="1954750"/>
-                                <a:ext cx="1248000" cy="3600"/>
-                              </a:xfrm>
-                              <a:prstGeom prst="straightConnector1">
-                                <a:avLst/>
-                              </a:prstGeom>
-                              <a:noFill/>
-                              <a:ln cap="flat" cmpd="sng" w="9525">
-                                <a:solidFill>
-                                  <a:srgbClr val="C0392B"/>
-                                </a:solidFill>
-                                <a:prstDash val="dot"/>
-                                <a:round/>
-                                <a:headEnd len="med" w="med" type="none"/>
-                                <a:tailEnd len="med" w="med" type="none"/>
-                              </a:ln>
-                            </wps:spPr>
-                            <wps:bodyPr anchorCtr="0" anchor="ctr" bIns="91425" lIns="91425" spcFirstLastPara="1" rIns="91425" wrap="square" tIns="91425">
-                              <a:noAutofit/>
-                            </wps:bodyPr>
-                          </wps:wsp>
-                        </wpg:grpSp>
-                      </wpg:grpSp>
-                    </wpg:wgp>
-                  </a:graphicData>
-                </a:graphic>
-              </wp:inline>
-            </w:drawing>
-          </mc:Choice>
-          <mc:Fallback>
-            <w:drawing>
-              <wp:inline distB="114300" distT="114300" distL="114300" distR="114300">
-                <wp:extent cx="6370316" cy="5248380"/>
-                <wp:effectExtent b="0" l="0" r="0" t="0"/>
-                <wp:docPr id="1" name="image4.png"/>
-                <a:graphic>
-                  <a:graphicData uri="http://schemas.openxmlformats.org/drawingml/2006/picture">
-                    <pic:pic>
-                      <pic:nvPicPr>
-                        <pic:cNvPr id="0" name="image4.png"/>
-                        <pic:cNvPicPr preferRelativeResize="0"/>
-                      </pic:nvPicPr>
-                      <pic:blipFill>
-                        <a:blip r:embed="rId10"/>
-                        <a:srcRect/>
-                        <a:stretch>
-                          <a:fillRect/>
-                        </a:stretch>
-                      </pic:blipFill>
-                      <pic:spPr>
-                        <a:xfrm>
-                          <a:off x="0" y="0"/>
-                          <a:ext cx="6370316" cy="5248380"/>
-                        </a:xfrm>
-                        <a:prstGeom prst="rect"/>
-                        <a:ln/>
-                      </pic:spPr>
-                    </pic:pic>
-                  </a:graphicData>
-                </a:graphic>
-              </wp:inline>
-            </w:drawing>
-          </mc:Fallback>
-        </mc:AlternateContent>
+        <w:drawing>
+          <wp:inline distB="114300" distT="114300" distL="114300" distR="114300">
+            <wp:extent cx="6480000" cy="5346700"/>
+            <wp:effectExtent b="0" l="0" r="0" t="0"/>
+            <wp:docPr id="7" name="image4.png"/>
+            <a:graphic>
+              <a:graphicData uri="http://schemas.openxmlformats.org/drawingml/2006/picture">
+                <pic:pic>
+                  <pic:nvPicPr>
+                    <pic:cNvPr id="0" name="image4.png"/>
+                    <pic:cNvPicPr preferRelativeResize="0"/>
+                  </pic:nvPicPr>
+                  <pic:blipFill>
+                    <a:blip r:embed="rId9"/>
+                    <a:srcRect b="0" l="0" r="0" t="0"/>
+                    <a:stretch>
+                      <a:fillRect/>
+                    </a:stretch>
+                  </pic:blipFill>
+                  <pic:spPr>
+                    <a:xfrm>
+                      <a:off x="0" y="0"/>
+                      <a:ext cx="6480000" cy="5346700"/>
+                    </a:xfrm>
+                    <a:prstGeom prst="rect"/>
+                    <a:ln/>
+                  </pic:spPr>
+                </pic:pic>
+              </a:graphicData>
+            </a:graphic>
+          </wp:inline>
+        </w:drawing>
       </w:r>
       <w:r>
         <w:rPr>
@@ -7799,7 +6002,7 @@
           <w:color w:val="231f20"/>
         </w:rPr>
       </w:pPr>
-      <w:bookmarkStart w:colFirst="0" w:colLast="0" w:name="_2hamgqx6bq9b" w:id="7"/>
+      <w:bookmarkStart w:colFirst="0" w:colLast="0" w:name="_ntjuh2lop5sz" w:id="7"/>
       <w:bookmarkEnd w:id="7"/>
       <w:r>
         <w:rPr>
@@ -7821,7 +6024,7 @@
         <w:ind w:left="576" w:right="-4.724409448817823" w:hanging="576"/>
         <w:rPr/>
       </w:pPr>
-      <w:bookmarkStart w:colFirst="0" w:colLast="0" w:name="_yyz44jlt1xo6" w:id="8"/>
+      <w:bookmarkStart w:colFirst="0" w:colLast="0" w:name="_pjvwvfvu44cy" w:id="8"/>
       <w:bookmarkEnd w:id="8"/>
       <w:r>
         <w:rPr>
@@ -7830,6 +6033,11 @@
           <w:rtl w:val="0"/>
         </w:rPr>
         <w:t xml:space="preserve">Description of the context</w:t>
+      </w:r>
+      <w:r>
+        <w:rPr>
+          <w:rtl w:val="0"/>
+        </w:rPr>
       </w:r>
     </w:p>
     <w:p>
@@ -7860,7 +6068,7 @@
         <w:ind w:left="576" w:right="-4.724409448817823" w:hanging="576"/>
         <w:rPr/>
       </w:pPr>
-      <w:bookmarkStart w:colFirst="0" w:colLast="0" w:name="_ti4nlluh37bo" w:id="9"/>
+      <w:bookmarkStart w:colFirst="0" w:colLast="0" w:name="_wg4ayx6mtnjj" w:id="9"/>
       <w:bookmarkEnd w:id="9"/>
       <w:r>
         <w:rPr>
@@ -7869,6 +6077,11 @@
           <w:rtl w:val="0"/>
         </w:rPr>
         <w:t xml:space="preserve">Definition of the risk evaluation criteria</w:t>
+      </w:r>
+      <w:r>
+        <w:rPr>
+          <w:rtl w:val="0"/>
+        </w:rPr>
       </w:r>
     </w:p>
     <w:p>
@@ -7884,7 +6097,7 @@
           <w:color w:val="231f20"/>
         </w:rPr>
       </w:pPr>
-      <w:bookmarkStart w:colFirst="0" w:colLast="0" w:name="_9mmt147o6zc7" w:id="10"/>
+      <w:bookmarkStart w:colFirst="0" w:colLast="0" w:name="_81xh5imhqk17" w:id="10"/>
       <w:bookmarkEnd w:id="10"/>
       <w:r>
         <w:rPr>
@@ -7908,7 +6121,7 @@
           <w:color w:val="231f20"/>
         </w:rPr>
       </w:pPr>
-      <w:bookmarkStart w:colFirst="0" w:colLast="0" w:name="_3tzntain28go" w:id="11"/>
+      <w:bookmarkStart w:colFirst="0" w:colLast="0" w:name="_hqsqafehz2j6" w:id="11"/>
       <w:bookmarkEnd w:id="11"/>
       <w:r>
         <w:rPr>
@@ -7982,7 +6195,7 @@
           <w:color w:val="231f20"/>
         </w:rPr>
       </w:pPr>
-      <w:bookmarkStart w:colFirst="0" w:colLast="0" w:name="_74mbvrw77rrp" w:id="12"/>
+      <w:bookmarkStart w:colFirst="0" w:colLast="0" w:name="_gq16pp76l5o7" w:id="12"/>
       <w:bookmarkEnd w:id="12"/>
       <w:r>
         <w:rPr>
@@ -8057,7 +6270,7 @@
           <w:color w:val="231f20"/>
         </w:rPr>
       </w:pPr>
-      <w:bookmarkStart w:colFirst="0" w:colLast="0" w:name="_n9ifa9sjeh7n" w:id="13"/>
+      <w:bookmarkStart w:colFirst="0" w:colLast="0" w:name="_hew0equjkyu8" w:id="13"/>
       <w:bookmarkEnd w:id="13"/>
       <w:r>
         <w:rPr>
@@ -8160,7 +6373,7 @@
           <w:color w:val="231f20"/>
         </w:rPr>
       </w:pPr>
-      <w:bookmarkStart w:colFirst="0" w:colLast="0" w:name="_msglliqq2z1" w:id="14"/>
+      <w:bookmarkStart w:colFirst="0" w:colLast="0" w:name="_hfdjvzadp2b5" w:id="14"/>
       <w:bookmarkEnd w:id="14"/>
       <w:r>
         <w:rPr>
@@ -8285,7 +6498,7 @@
           <w:color w:val="231f20"/>
         </w:rPr>
       </w:pPr>
-      <w:bookmarkStart w:colFirst="0" w:colLast="0" w:name="_drxc8yxq0kha" w:id="15"/>
+      <w:bookmarkStart w:colFirst="0" w:colLast="0" w:name="_6kktwmxrmh0w" w:id="15"/>
       <w:bookmarkEnd w:id="15"/>
       <w:r>
         <w:rPr>
@@ -8309,7 +6522,7 @@
           <w:color w:val="231f20"/>
         </w:rPr>
       </w:pPr>
-      <w:bookmarkStart w:colFirst="0" w:colLast="0" w:name="_m56ppffewdyy" w:id="16"/>
+      <w:bookmarkStart w:colFirst="0" w:colLast="0" w:name="_4ocpxoff8wtq" w:id="16"/>
       <w:bookmarkEnd w:id="16"/>
       <w:r>
         <w:rPr>
@@ -8350,7 +6563,7 @@
           <w:color w:val="231f20"/>
         </w:rPr>
       </w:pPr>
-      <w:bookmarkStart w:colFirst="0" w:colLast="0" w:name="_y8n5dpti3ll0" w:id="17"/>
+      <w:bookmarkStart w:colFirst="0" w:colLast="0" w:name="_jk1k0fgw8gex" w:id="17"/>
       <w:bookmarkEnd w:id="17"/>
       <w:r>
         <w:rPr>
@@ -8391,7 +6604,7 @@
           <w:color w:val="231f20"/>
         </w:rPr>
       </w:pPr>
-      <w:bookmarkStart w:colFirst="0" w:colLast="0" w:name="_c1o5s2a5nwel" w:id="18"/>
+      <w:bookmarkStart w:colFirst="0" w:colLast="0" w:name="_4nnfqvb8l8ec" w:id="18"/>
       <w:bookmarkEnd w:id="18"/>
       <w:r>
         <w:rPr>
@@ -8439,7 +6652,7 @@
         <w:ind w:left="576" w:right="-4.724409448817823" w:hanging="576"/>
         <w:rPr/>
       </w:pPr>
-      <w:bookmarkStart w:colFirst="0" w:colLast="0" w:name="_x8dsslbabknk" w:id="19"/>
+      <w:bookmarkStart w:colFirst="0" w:colLast="0" w:name="_leyi41lt22tu" w:id="19"/>
       <w:bookmarkEnd w:id="19"/>
       <w:r>
         <w:rPr>
@@ -8448,6 +6661,11 @@
           <w:rtl w:val="0"/>
         </w:rPr>
         <w:t xml:space="preserve">Evaluation of trends and threats</w:t>
+      </w:r>
+      <w:r>
+        <w:rPr>
+          <w:rtl w:val="0"/>
+        </w:rPr>
       </w:r>
     </w:p>
     <w:p>
@@ -8555,7 +6773,7 @@
           <w:color w:val="231f20"/>
         </w:rPr>
       </w:pPr>
-      <w:bookmarkStart w:colFirst="0" w:colLast="0" w:name="_3fp7fge911cv" w:id="20"/>
+      <w:bookmarkStart w:colFirst="0" w:colLast="0" w:name="_dqg7o9c3902q" w:id="20"/>
       <w:bookmarkEnd w:id="20"/>
       <w:r>
         <w:rPr>
@@ -8576,7 +6794,7 @@
         <w:ind w:left="576" w:right="-4.724409448817823" w:hanging="576"/>
         <w:rPr/>
       </w:pPr>
-      <w:bookmarkStart w:colFirst="0" w:colLast="0" w:name="_w7whk0y0oy2y" w:id="21"/>
+      <w:bookmarkStart w:colFirst="0" w:colLast="0" w:name="_z2nxdsbogpr" w:id="21"/>
       <w:bookmarkEnd w:id="21"/>
       <w:r>
         <w:rPr>
@@ -8585,6 +6803,11 @@
           <w:rtl w:val="0"/>
         </w:rPr>
         <w:t xml:space="preserve">Identifying the assets </w:t>
+      </w:r>
+      <w:r>
+        <w:rPr>
+          <w:rtl w:val="0"/>
+        </w:rPr>
       </w:r>
     </w:p>
     <w:p>
@@ -8622,7 +6845,7 @@
         <w:ind w:left="576" w:right="-4.724409448817823" w:hanging="576"/>
         <w:rPr/>
       </w:pPr>
-      <w:bookmarkStart w:colFirst="0" w:colLast="0" w:name="_l57bfw29q5sy" w:id="22"/>
+      <w:bookmarkStart w:colFirst="0" w:colLast="0" w:name="_gtcj9wu54ht4" w:id="22"/>
       <w:bookmarkEnd w:id="22"/>
       <w:r>
         <w:rPr>
@@ -8631,6 +6854,11 @@
           <w:rtl w:val="0"/>
         </w:rPr>
         <w:t xml:space="preserve">Identifying the vulnerabilities </w:t>
+      </w:r>
+      <w:r>
+        <w:rPr>
+          <w:rtl w:val="0"/>
+        </w:rPr>
       </w:r>
     </w:p>
     <w:p>
@@ -8679,7 +6907,7 @@
         <w:ind w:left="576" w:right="-4.724409448817823" w:hanging="576"/>
         <w:rPr/>
       </w:pPr>
-      <w:bookmarkStart w:colFirst="0" w:colLast="0" w:name="_hlcno0nu7e4h" w:id="23"/>
+      <w:bookmarkStart w:colFirst="0" w:colLast="0" w:name="_769tlw11um2f" w:id="23"/>
       <w:bookmarkEnd w:id="23"/>
       <w:r>
         <w:rPr>
@@ -8688,6 +6916,11 @@
           <w:rtl w:val="0"/>
         </w:rPr>
         <w:t xml:space="preserve">Assessing the consequences</w:t>
+      </w:r>
+      <w:r>
+        <w:rPr>
+          <w:rtl w:val="0"/>
+        </w:rPr>
       </w:r>
     </w:p>
     <w:p>
@@ -8790,7 +7023,7 @@
           <w:color w:val="231f20"/>
         </w:rPr>
       </w:pPr>
-      <w:bookmarkStart w:colFirst="0" w:colLast="0" w:name="_u0z7iu6uc0qc" w:id="24"/>
+      <w:bookmarkStart w:colFirst="0" w:colLast="0" w:name="_441hvwtf2qkb" w:id="24"/>
       <w:bookmarkEnd w:id="24"/>
       <w:r>
         <w:rPr>
@@ -8847,7 +7080,7 @@
         <w:ind w:left="567" w:right="-4.724409448817823" w:hanging="576"/>
         <w:rPr/>
       </w:pPr>
-      <w:bookmarkStart w:colFirst="0" w:colLast="0" w:name="_netmp5hfzh5w" w:id="25"/>
+      <w:bookmarkStart w:colFirst="0" w:colLast="0" w:name="_fr1yutmhiiny" w:id="25"/>
       <w:bookmarkEnd w:id="25"/>
       <w:r>
         <w:rPr>
@@ -8856,6 +7089,11 @@
           <w:rtl w:val="0"/>
         </w:rPr>
         <w:t xml:space="preserve">Summary of the risk evaluation</w:t>
+      </w:r>
+      <w:r>
+        <w:rPr>
+          <w:rtl w:val="0"/>
+        </w:rPr>
       </w:r>
     </w:p>
     <w:p>
@@ -8889,7 +7127,7 @@
           <w:color w:val="231f20"/>
         </w:rPr>
       </w:pPr>
-      <w:bookmarkStart w:colFirst="0" w:colLast="0" w:name="_vytahvov7q30" w:id="26"/>
+      <w:bookmarkStart w:colFirst="0" w:colLast="0" w:name="_8ou8q11votq3" w:id="26"/>
       <w:bookmarkEnd w:id="26"/>
       <w:r>
         <w:rPr>
@@ -8962,7 +7200,7 @@
           <w:color w:val="231f20"/>
         </w:rPr>
       </w:pPr>
-      <w:bookmarkStart w:colFirst="0" w:colLast="0" w:name="_52pn71loctf1" w:id="27"/>
+      <w:bookmarkStart w:colFirst="0" w:colLast="0" w:name="_q4si9mgoolx" w:id="27"/>
       <w:bookmarkEnd w:id="27"/>
       <w:r>
         <w:rPr>
@@ -9045,8 +7283,8 @@
           <w:color w:val="231f20"/>
         </w:rPr>
         <w:sectPr>
-          <w:headerReference r:id="rId11" w:type="default"/>
-          <w:footerReference r:id="rId12" w:type="default"/>
+          <w:headerReference r:id="rId10" w:type="default"/>
+          <w:footerReference r:id="rId11" w:type="default"/>
           <w:pgSz w:h="16838" w:w="11906" w:orient="portrait"/>
           <w:pgMar w:bottom="1133.8582677165355" w:top="1133.8582677165355" w:left="850.3937007874016" w:right="850.3937007874016" w:header="562" w:footer="562"/>
           <w:pgNumType w:start="1"/>
@@ -9072,7 +7310,7 @@
         <w:ind w:left="567" w:right="-4.724409448817823" w:hanging="576"/>
         <w:rPr/>
       </w:pPr>
-      <w:bookmarkStart w:colFirst="0" w:colLast="0" w:name="_bcmlszdnye84" w:id="28"/>
+      <w:bookmarkStart w:colFirst="0" w:colLast="0" w:name="_gt8y3s7mayqu" w:id="28"/>
       <w:bookmarkEnd w:id="28"/>
       <w:r>
         <w:rPr>
@@ -9081,6 +7319,11 @@
           <w:rtl w:val="0"/>
         </w:rPr>
         <w:t xml:space="preserve">Risk treatment</w:t>
+      </w:r>
+      <w:r>
+        <w:rPr>
+          <w:rtl w:val="0"/>
+        </w:rPr>
       </w:r>
     </w:p>
     <w:p>
@@ -9096,7 +7339,7 @@
           <w:color w:val="231f20"/>
         </w:rPr>
       </w:pPr>
-      <w:bookmarkStart w:colFirst="0" w:colLast="0" w:name="_crug6p9xjxkq" w:id="29"/>
+      <w:bookmarkStart w:colFirst="0" w:colLast="0" w:name="_evsqjyu2egbq" w:id="29"/>
       <w:bookmarkEnd w:id="29"/>
       <w:r>
         <w:rPr>
@@ -9137,7 +7380,7 @@
           <w:color w:val="231f20"/>
         </w:rPr>
       </w:pPr>
-      <w:bookmarkStart w:colFirst="0" w:colLast="0" w:name="_xuzejz4r36e7" w:id="30"/>
+      <w:bookmarkStart w:colFirst="0" w:colLast="0" w:name="_b1j2g3xpw1ju" w:id="30"/>
       <w:bookmarkEnd w:id="30"/>
       <w:r>
         <w:rPr>
@@ -9256,7 +7499,7 @@
           <w:vertAlign w:val="baseline"/>
         </w:rPr>
       </w:pPr>
-      <w:bookmarkStart w:colFirst="0" w:colLast="0" w:name="_158b8ha8du73" w:id="31"/>
+      <w:bookmarkStart w:colFirst="0" w:colLast="0" w:name="_bcihj1jblrnr" w:id="31"/>
       <w:bookmarkEnd w:id="31"/>
       <w:r>
         <w:rPr>
@@ -9330,7 +7573,7 @@
           <w:vertAlign w:val="baseline"/>
         </w:rPr>
       </w:pPr>
-      <w:bookmarkStart w:colFirst="0" w:colLast="0" w:name="_6pzgbk7qlumf" w:id="32"/>
+      <w:bookmarkStart w:colFirst="0" w:colLast="0" w:name="_72mgvugqendc" w:id="32"/>
       <w:bookmarkEnd w:id="32"/>
       <w:r>
         <w:rPr>
@@ -9381,9 +7624,9 @@
           <w:color w:val="231f20"/>
         </w:rPr>
         <w:sectPr>
-          <w:headerReference r:id="rId13" w:type="default"/>
-          <w:headerReference r:id="rId14" w:type="first"/>
-          <w:footerReference r:id="rId15" w:type="default"/>
+          <w:headerReference r:id="rId12" w:type="default"/>
+          <w:headerReference r:id="rId13" w:type="first"/>
+          <w:footerReference r:id="rId14" w:type="default"/>
           <w:type w:val="nextPage"/>
           <w:pgSz w:h="11906" w:w="16838" w:orient="landscape"/>
           <w:pgMar w:bottom="1133.8582677165355" w:top="1133.8582677165355" w:left="850.3937007874016" w:right="850.3937007874016" w:header="562" w:footer="562"/>
@@ -9407,7 +7650,7 @@
           <w:color w:val="231f20"/>
         </w:rPr>
       </w:pPr>
-      <w:bookmarkStart w:colFirst="0" w:colLast="0" w:name="_aqnqjjitv0lo" w:id="33"/>
+      <w:bookmarkStart w:colFirst="0" w:colLast="0" w:name="_kobrd2o323bd" w:id="33"/>
       <w:bookmarkEnd w:id="33"/>
       <w:r>
         <w:rPr>
@@ -9511,7 +7754,7 @@
           <w:color w:val="231f20"/>
         </w:rPr>
       </w:pPr>
-      <w:bookmarkStart w:colFirst="0" w:colLast="0" w:name="_agtknyi6bwqf" w:id="34"/>
+      <w:bookmarkStart w:colFirst="0" w:colLast="0" w:name="_i03kvu451n53" w:id="34"/>
       <w:bookmarkEnd w:id="34"/>
       <w:r>
         <w:rPr>
@@ -9565,7 +7808,7 @@
           <w:color w:val="231f20"/>
         </w:rPr>
       </w:pPr>
-      <w:bookmarkStart w:colFirst="0" w:colLast="0" w:name="_t7oggdnl7b2k" w:id="35"/>
+      <w:bookmarkStart w:colFirst="0" w:colLast="0" w:name="_1489lz8920r9" w:id="35"/>
       <w:bookmarkEnd w:id="35"/>
       <w:r>
         <w:rPr>
@@ -9610,7 +7853,7 @@
           <w:color w:val="231f20"/>
         </w:rPr>
       </w:pPr>
-      <w:bookmarkStart w:colFirst="0" w:colLast="0" w:name="_ud3jy1wlaghd" w:id="36"/>
+      <w:bookmarkStart w:colFirst="0" w:colLast="0" w:name="_xisr2nertyts" w:id="36"/>
       <w:bookmarkEnd w:id="36"/>
       <w:r>
         <w:rPr>
@@ -9655,7 +7898,7 @@
           <w:color w:val="231f20"/>
         </w:rPr>
       </w:pPr>
-      <w:bookmarkStart w:colFirst="0" w:colLast="0" w:name="_jkrbwn7e7aj3" w:id="37"/>
+      <w:bookmarkStart w:colFirst="0" w:colLast="0" w:name="_86kqdzeoxl6q" w:id="37"/>
       <w:bookmarkEnd w:id="37"/>
       <w:r>
         <w:rPr>
@@ -9674,9 +7917,9 @@
           <w:color w:val="231f20"/>
         </w:rPr>
         <w:sectPr>
-          <w:headerReference r:id="rId16" w:type="default"/>
-          <w:headerReference r:id="rId17" w:type="first"/>
-          <w:footerReference r:id="rId18" w:type="default"/>
+          <w:headerReference r:id="rId15" w:type="default"/>
+          <w:headerReference r:id="rId16" w:type="first"/>
+          <w:footerReference r:id="rId17" w:type="default"/>
           <w:type w:val="nextPage"/>
           <w:pgSz w:h="16838" w:w="11906" w:orient="portrait"/>
           <w:pgMar w:bottom="1133.8582677165355" w:top="1133.8582677165355" w:left="850.3937007874016" w:right="850.3937007874016" w:header="562" w:footer="562"/>
@@ -9709,7 +7952,7 @@
           <w:color w:val="231f20"/>
         </w:rPr>
       </w:pPr>
-      <w:bookmarkStart w:colFirst="0" w:colLast="0" w:name="_l7rcsn2dugwe" w:id="38"/>
+      <w:bookmarkStart w:colFirst="0" w:colLast="0" w:name="_glk5yk9llptn" w:id="38"/>
       <w:bookmarkEnd w:id="38"/>
       <w:r>
         <w:rPr>
@@ -9729,7 +7972,7 @@
           <w:color w:val="231f20"/>
         </w:rPr>
       </w:pPr>
-      <w:bookmarkStart w:colFirst="0" w:colLast="0" w:name="_kwddsnwfw0ic" w:id="39"/>
+      <w:bookmarkStart w:colFirst="0" w:colLast="0" w:name="_iytv8dofr6o0" w:id="39"/>
       <w:bookmarkEnd w:id="39"/>
       <w:r>
         <w:rPr>
@@ -9785,7 +8028,7 @@
           <w:color w:val="231f20"/>
         </w:rPr>
       </w:pPr>
-      <w:bookmarkStart w:colFirst="0" w:colLast="0" w:name="_31wjktbjuzuf" w:id="40"/>
+      <w:bookmarkStart w:colFirst="0" w:colLast="0" w:name="_mygdlag4lumq" w:id="40"/>
       <w:bookmarkEnd w:id="40"/>
       <w:r>
         <w:rPr>
@@ -9815,8 +8058,8 @@
       </w:r>
     </w:p>
     <w:sectPr>
-      <w:headerReference r:id="rId19" w:type="default"/>
-      <w:footerReference r:id="rId20" w:type="default"/>
+      <w:headerReference r:id="rId18" w:type="default"/>
+      <w:footerReference r:id="rId19" w:type="default"/>
       <w:type w:val="nextPage"/>
       <w:pgSz w:h="11906" w:w="16838" w:orient="landscape"/>
       <w:pgMar w:bottom="1133.8582677165355" w:top="1133.8582677165355" w:left="850.3937007874016" w:right="850.3937007874016" w:header="561" w:footer="561"/>
@@ -10007,7 +8250,7 @@
           <wp:extent cx="962941" cy="363600"/>
           <wp:effectExtent b="0" l="0" r="0" t="0"/>
           <wp:wrapNone/>
-          <wp:docPr id="6" name="image1.png"/>
+          <wp:docPr id="4" name="image1.png"/>
           <a:graphic>
             <a:graphicData uri="http://schemas.openxmlformats.org/drawingml/2006/picture">
               <pic:pic>
@@ -10229,7 +8472,7 @@
           <wp:extent cx="962941" cy="363600"/>
           <wp:effectExtent b="0" l="0" r="0" t="0"/>
           <wp:wrapNone/>
-          <wp:docPr id="8" name="image1.png"/>
+          <wp:docPr id="3" name="image1.png"/>
           <a:graphic>
             <a:graphicData uri="http://schemas.openxmlformats.org/drawingml/2006/picture">
               <pic:pic>
@@ -10444,7 +8687,7 @@
           <wp:extent cx="962941" cy="363600"/>
           <wp:effectExtent b="0" l="0" r="0" t="0"/>
           <wp:wrapNone/>
-          <wp:docPr id="7" name="image1.png"/>
+          <wp:docPr id="5" name="image1.png"/>
           <a:graphic>
             <a:graphicData uri="http://schemas.openxmlformats.org/drawingml/2006/picture">
               <pic:pic>
@@ -10666,7 +8909,7 @@
           <wp:extent cx="962941" cy="363600"/>
           <wp:effectExtent b="0" l="0" r="0" t="0"/>
           <wp:wrapNone/>
-          <wp:docPr id="9" name="image1.png"/>
+          <wp:docPr id="6" name="image1.png"/>
           <a:graphic>
             <a:graphicData uri="http://schemas.openxmlformats.org/drawingml/2006/picture">
               <pic:pic>
@@ -10729,15 +8972,15 @@
         <wp:anchor allowOverlap="1" behindDoc="0" distB="0" distT="0" distL="114300" distR="114300" hidden="0" layoutInCell="1" locked="0" relativeHeight="0" simplePos="0">
           <wp:simplePos x="0" y="0"/>
           <wp:positionH relativeFrom="column">
-            <wp:posOffset>28577</wp:posOffset>
+            <wp:posOffset>28578</wp:posOffset>
           </wp:positionH>
           <wp:positionV relativeFrom="paragraph">
-            <wp:posOffset>-44992</wp:posOffset>
+            <wp:posOffset>-44991</wp:posOffset>
           </wp:positionV>
           <wp:extent cx="1355753" cy="1011600"/>
           <wp:effectExtent b="0" l="0" r="0" t="0"/>
           <wp:wrapNone/>
-          <wp:docPr id="11" name="image2.png"/>
+          <wp:docPr id="13" name="image2.png"/>
           <a:graphic>
             <a:graphicData uri="http://schemas.openxmlformats.org/drawingml/2006/picture">
               <pic:pic>
@@ -10794,7 +9037,7 @@
     <w:tr>
       <w:trPr>
         <w:cantSplit w:val="0"/>
-        <w:trHeight w:val="202" w:hRule="atLeast"/>
+        <w:trHeight w:val="402.7734375" w:hRule="atLeast"/>
         <w:tblHeader w:val="0"/>
       </w:trPr>
       <w:tc>
@@ -11367,15 +9610,15 @@
         <wp:anchor allowOverlap="1" behindDoc="0" distB="0" distT="0" distL="114300" distR="114300" hidden="0" layoutInCell="1" locked="0" relativeHeight="0" simplePos="0">
           <wp:simplePos x="0" y="0"/>
           <wp:positionH relativeFrom="column">
-            <wp:posOffset>57152</wp:posOffset>
+            <wp:posOffset>57153</wp:posOffset>
           </wp:positionH>
           <wp:positionV relativeFrom="paragraph">
-            <wp:posOffset>-123254</wp:posOffset>
+            <wp:posOffset>-123253</wp:posOffset>
           </wp:positionV>
           <wp:extent cx="1355753" cy="1011600"/>
           <wp:effectExtent b="0" l="0" r="0" t="0"/>
           <wp:wrapNone/>
-          <wp:docPr id="10" name="image2.png"/>
+          <wp:docPr id="12" name="image2.png"/>
           <a:graphic>
             <a:graphicData uri="http://schemas.openxmlformats.org/drawingml/2006/picture">
               <pic:pic>
@@ -12052,7 +10295,7 @@
               <wp:anchor allowOverlap="1" behindDoc="1" distB="0" distT="0" distL="0" distR="0" hidden="0" layoutInCell="1" locked="0" relativeHeight="0" simplePos="0">
                 <wp:simplePos x="0" y="0"/>
                 <wp:positionH relativeFrom="column">
-                  <wp:posOffset>-60323</wp:posOffset>
+                  <wp:posOffset>-60322</wp:posOffset>
                 </wp:positionH>
                 <wp:positionV relativeFrom="paragraph">
                   <wp:posOffset>635</wp:posOffset>
@@ -12060,7 +10303,7 @@
                 <wp:extent cx="1209040" cy="532765"/>
                 <wp:effectExtent b="0" l="0" r="0" t="0"/>
                 <wp:wrapNone/>
-                <wp:docPr id="3" name="image3.png"/>
+                <wp:docPr id="1" name="image3.png"/>
                 <a:graphic>
                   <a:graphicData uri="http://schemas.openxmlformats.org/drawingml/2006/picture">
                     <pic:pic>
@@ -12601,15 +10844,15 @@
         <wp:anchor allowOverlap="1" behindDoc="0" distB="0" distT="0" distL="114300" distR="114300" hidden="0" layoutInCell="1" locked="0" relativeHeight="0" simplePos="0">
           <wp:simplePos x="0" y="0"/>
           <wp:positionH relativeFrom="column">
-            <wp:posOffset>57152</wp:posOffset>
+            <wp:posOffset>57153</wp:posOffset>
           </wp:positionH>
           <wp:positionV relativeFrom="paragraph">
-            <wp:posOffset>-150336</wp:posOffset>
+            <wp:posOffset>-150335</wp:posOffset>
           </wp:positionV>
           <wp:extent cx="1355753" cy="1011600"/>
           <wp:effectExtent b="0" l="0" r="0" t="0"/>
           <wp:wrapNone/>
-          <wp:docPr id="12" name="image2.png"/>
+          <wp:docPr id="9" name="image2.png"/>
           <a:graphic>
             <a:graphicData uri="http://schemas.openxmlformats.org/drawingml/2006/picture">
               <pic:pic>
@@ -13286,7 +11529,7 @@
               <wp:anchor allowOverlap="1" behindDoc="1" distB="0" distT="0" distL="0" distR="0" hidden="0" layoutInCell="1" locked="0" relativeHeight="0" simplePos="0">
                 <wp:simplePos x="0" y="0"/>
                 <wp:positionH relativeFrom="column">
-                  <wp:posOffset>-60323</wp:posOffset>
+                  <wp:posOffset>-60322</wp:posOffset>
                 </wp:positionH>
                 <wp:positionV relativeFrom="paragraph">
                   <wp:posOffset>635</wp:posOffset>
@@ -13294,7 +11537,7 @@
                 <wp:extent cx="1209040" cy="532765"/>
                 <wp:effectExtent b="0" l="0" r="0" t="0"/>
                 <wp:wrapNone/>
-                <wp:docPr id="4" name="image3.png"/>
+                <wp:docPr id="2" name="image3.png"/>
                 <a:graphic>
                   <a:graphicData uri="http://schemas.openxmlformats.org/drawingml/2006/picture">
                     <pic:pic>
@@ -13814,15 +12057,15 @@
         <wp:anchor allowOverlap="1" behindDoc="0" distB="0" distT="0" distL="114300" distR="114300" hidden="0" layoutInCell="1" locked="0" relativeHeight="0" simplePos="0">
           <wp:simplePos x="0" y="0"/>
           <wp:positionH relativeFrom="column">
-            <wp:posOffset>47627</wp:posOffset>
+            <wp:posOffset>47628</wp:posOffset>
           </wp:positionH>
           <wp:positionV relativeFrom="paragraph">
-            <wp:posOffset>-150336</wp:posOffset>
+            <wp:posOffset>-150335</wp:posOffset>
           </wp:positionV>
           <wp:extent cx="1355753" cy="1011600"/>
           <wp:effectExtent b="0" l="0" r="0" t="0"/>
           <wp:wrapNone/>
-          <wp:docPr id="5" name="image2.png"/>
+          <wp:docPr id="10" name="image2.png"/>
           <a:graphic>
             <a:graphicData uri="http://schemas.openxmlformats.org/drawingml/2006/picture">
               <pic:pic>
@@ -13879,7 +12122,7 @@
     <w:tr>
       <w:trPr>
         <w:cantSplit w:val="0"/>
-        <w:trHeight w:val="202" w:hRule="atLeast"/>
+        <w:trHeight w:val="417.7734375" w:hRule="atLeast"/>
         <w:tblHeader w:val="0"/>
       </w:trPr>
       <w:tc>

</xml_diff>